<commit_message>
working towards final paper submission code
</commit_message>
<xml_diff>
--- a/Outputs/table1.docx
+++ b/Outputs/table1.docx
@@ -491,7 +491,7 @@
                 <w:szCs w:val="20"/>
                 <w:color w:val="000000"/>
               </w:rPr>
-              <w:t xml:space="preserve">gender: Female</w:t>
+              <w:t xml:space="preserve">sex: Female</w:t>
             </w:r>
           </w:p>
         </w:tc>
@@ -705,7 +705,7 @@
                 <w:szCs w:val="20"/>
                 <w:color w:val="000000"/>
               </w:rPr>
-              <w:t xml:space="preserve">gender: Male</w:t>
+              <w:t xml:space="preserve">sex: Male</w:t>
             </w:r>
           </w:p>
         </w:tc>
@@ -1133,7 +1133,59 @@
                 <w:szCs w:val="20"/>
                 <w:color w:val="000000"/>
               </w:rPr>
-              <w:t xml:space="preserve">SBP</w:t>
+              <w:t xml:space="preserve">injury_type: Blunt</w:t>
+            </w:r>
+          </w:p>
+        </w:tc>
+        <w:tc>
+          <w:tcPr>
+            <w:tcBorders>
+              <w:bottom w:val="none" w:sz="0" w:space="0" w:color="000000"/>
+              <w:top w:val="none" w:sz="0" w:space="0" w:color="000000"/>
+              <w:left w:val="none" w:sz="0" w:space="0" w:color="000000"/>
+              <w:right w:val="none" w:sz="0" w:space="0" w:color="000000"/>
+            </w:tcBorders>
+            <w:shd w:val="clear" w:color="auto" w:fill="FFFFFF"/>
+            <w:tcMar>
+              <w:top w:w="0" w:type="dxa"/>
+              <w:bottom w:w="0" w:type="dxa"/>
+              <w:left w:w="0" w:type="dxa"/>
+              <w:right w:w="0" w:type="dxa"/>
+            </w:tcMar>
+            <w:vAlign w:val="center"/>
+          </w:tcPr>
+          <w:p>
+            <w:pPr>
+              <w:jc w:val="center"/>
+              <w:pBdr>
+                <w:bottom w:val="none" w:sz="0" w:space="0" w:color="000000"/>
+                <w:top w:val="none" w:sz="0" w:space="0" w:color="000000"/>
+                <w:left w:val="none" w:sz="0" w:space="0" w:color="000000"/>
+                <w:right w:val="none" w:sz="0" w:space="0" w:color="000000"/>
+              </w:pBdr>
+              <w:spacing w:after="100" w:before="100" w:line="240"/>
+              <w:ind w:left="100" w:right="100" w:firstLine="0" w:firstLineChars="0"/>
+              <w:rPr>
+                <w:rFonts w:ascii="Helvetica" w:hAnsi="Helvetica" w:eastAsia="Helvetica" w:cs="Helvetica"/>
+                <w:i w:val="false"/>
+                <w:b w:val="false"/>
+                <w:u w:val="none"/>
+                <w:sz w:val="20"/>
+                <w:szCs w:val="20"/>
+                <w:color w:val="000000"/>
+              </w:rPr>
+            </w:pPr>
+            <w:r>
+              <w:rPr>
+                <w:rFonts w:ascii="Helvetica" w:hAnsi="Helvetica" w:eastAsia="Helvetica" w:cs="Helvetica"/>
+                <w:i w:val="false"/>
+                <w:b w:val="false"/>
+                <w:u w:val="none"/>
+                <w:sz w:val="20"/>
+                <w:szCs w:val="20"/>
+                <w:color w:val="000000"/>
+              </w:rPr>
+              <w:t xml:space="preserve">15 (11%)</w:t>
             </w:r>
           </w:p>
         </w:tc>
@@ -1237,59 +1289,7 @@
                 <w:szCs w:val="20"/>
                 <w:color w:val="000000"/>
               </w:rPr>
-              <w:t xml:space="preserve">98 ± 37.7</w:t>
-            </w:r>
-          </w:p>
-        </w:tc>
-        <w:tc>
-          <w:tcPr>
-            <w:tcBorders>
-              <w:bottom w:val="none" w:sz="0" w:space="0" w:color="000000"/>
-              <w:top w:val="none" w:sz="0" w:space="0" w:color="000000"/>
-              <w:left w:val="none" w:sz="0" w:space="0" w:color="000000"/>
-              <w:right w:val="none" w:sz="0" w:space="0" w:color="000000"/>
-            </w:tcBorders>
-            <w:shd w:val="clear" w:color="auto" w:fill="FFFFFF"/>
-            <w:tcMar>
-              <w:top w:w="0" w:type="dxa"/>
-              <w:bottom w:w="0" w:type="dxa"/>
-              <w:left w:w="0" w:type="dxa"/>
-              <w:right w:w="0" w:type="dxa"/>
-            </w:tcMar>
-            <w:vAlign w:val="center"/>
-          </w:tcPr>
-          <w:p>
-            <w:pPr>
-              <w:jc w:val="center"/>
-              <w:pBdr>
-                <w:bottom w:val="none" w:sz="0" w:space="0" w:color="000000"/>
-                <w:top w:val="none" w:sz="0" w:space="0" w:color="000000"/>
-                <w:left w:val="none" w:sz="0" w:space="0" w:color="000000"/>
-                <w:right w:val="none" w:sz="0" w:space="0" w:color="000000"/>
-              </w:pBdr>
-              <w:spacing w:after="100" w:before="100" w:line="240"/>
-              <w:ind w:left="100" w:right="100" w:firstLine="0" w:firstLineChars="0"/>
-              <w:rPr>
-                <w:rFonts w:ascii="Helvetica" w:hAnsi="Helvetica" w:eastAsia="Helvetica" w:cs="Helvetica"/>
-                <w:i w:val="false"/>
-                <w:b w:val="false"/>
-                <w:u w:val="none"/>
-                <w:sz w:val="20"/>
-                <w:szCs w:val="20"/>
-                <w:color w:val="000000"/>
-              </w:rPr>
-            </w:pPr>
-            <w:r>
-              <w:rPr>
-                <w:rFonts w:ascii="Helvetica" w:hAnsi="Helvetica" w:eastAsia="Helvetica" w:cs="Helvetica"/>
-                <w:i w:val="false"/>
-                <w:b w:val="false"/>
-                <w:u w:val="none"/>
-                <w:sz w:val="20"/>
-                <w:szCs w:val="20"/>
-                <w:color w:val="000000"/>
-              </w:rPr>
-              <w:t xml:space="preserve">101 [80–125.8]</w:t>
+              <w:t xml:space="preserve"/>
             </w:r>
           </w:p>
         </w:tc>
@@ -1347,7 +1347,59 @@
                 <w:szCs w:val="20"/>
                 <w:color w:val="000000"/>
               </w:rPr>
-              <w:t xml:space="preserve">DBP</w:t>
+              <w:t xml:space="preserve">injury_type: Penetrating</w:t>
+            </w:r>
+          </w:p>
+        </w:tc>
+        <w:tc>
+          <w:tcPr>
+            <w:tcBorders>
+              <w:bottom w:val="none" w:sz="0" w:space="0" w:color="000000"/>
+              <w:top w:val="none" w:sz="0" w:space="0" w:color="000000"/>
+              <w:left w:val="none" w:sz="0" w:space="0" w:color="000000"/>
+              <w:right w:val="none" w:sz="0" w:space="0" w:color="000000"/>
+            </w:tcBorders>
+            <w:shd w:val="clear" w:color="auto" w:fill="FFFFFF"/>
+            <w:tcMar>
+              <w:top w:w="0" w:type="dxa"/>
+              <w:bottom w:w="0" w:type="dxa"/>
+              <w:left w:w="0" w:type="dxa"/>
+              <w:right w:w="0" w:type="dxa"/>
+            </w:tcMar>
+            <w:vAlign w:val="center"/>
+          </w:tcPr>
+          <w:p>
+            <w:pPr>
+              <w:jc w:val="center"/>
+              <w:pBdr>
+                <w:bottom w:val="none" w:sz="0" w:space="0" w:color="000000"/>
+                <w:top w:val="none" w:sz="0" w:space="0" w:color="000000"/>
+                <w:left w:val="none" w:sz="0" w:space="0" w:color="000000"/>
+                <w:right w:val="none" w:sz="0" w:space="0" w:color="000000"/>
+              </w:pBdr>
+              <w:spacing w:after="100" w:before="100" w:line="240"/>
+              <w:ind w:left="100" w:right="100" w:firstLine="0" w:firstLineChars="0"/>
+              <w:rPr>
+                <w:rFonts w:ascii="Helvetica" w:hAnsi="Helvetica" w:eastAsia="Helvetica" w:cs="Helvetica"/>
+                <w:i w:val="false"/>
+                <w:b w:val="false"/>
+                <w:u w:val="none"/>
+                <w:sz w:val="20"/>
+                <w:szCs w:val="20"/>
+                <w:color w:val="000000"/>
+              </w:rPr>
+            </w:pPr>
+            <w:r>
+              <w:rPr>
+                <w:rFonts w:ascii="Helvetica" w:hAnsi="Helvetica" w:eastAsia="Helvetica" w:cs="Helvetica"/>
+                <w:i w:val="false"/>
+                <w:b w:val="false"/>
+                <w:u w:val="none"/>
+                <w:sz w:val="20"/>
+                <w:szCs w:val="20"/>
+                <w:color w:val="000000"/>
+              </w:rPr>
+              <w:t xml:space="preserve">117 (89%)</w:t>
             </w:r>
           </w:p>
         </w:tc>
@@ -1451,59 +1503,7 @@
                 <w:szCs w:val="20"/>
                 <w:color w:val="000000"/>
               </w:rPr>
-              <w:t xml:space="preserve">57.8 ± 34.2</w:t>
-            </w:r>
-          </w:p>
-        </w:tc>
-        <w:tc>
-          <w:tcPr>
-            <w:tcBorders>
-              <w:bottom w:val="none" w:sz="0" w:space="0" w:color="000000"/>
-              <w:top w:val="none" w:sz="0" w:space="0" w:color="000000"/>
-              <w:left w:val="none" w:sz="0" w:space="0" w:color="000000"/>
-              <w:right w:val="none" w:sz="0" w:space="0" w:color="000000"/>
-            </w:tcBorders>
-            <w:shd w:val="clear" w:color="auto" w:fill="FFFFFF"/>
-            <w:tcMar>
-              <w:top w:w="0" w:type="dxa"/>
-              <w:bottom w:w="0" w:type="dxa"/>
-              <w:left w:w="0" w:type="dxa"/>
-              <w:right w:w="0" w:type="dxa"/>
-            </w:tcMar>
-            <w:vAlign w:val="center"/>
-          </w:tcPr>
-          <w:p>
-            <w:pPr>
-              <w:jc w:val="center"/>
-              <w:pBdr>
-                <w:bottom w:val="none" w:sz="0" w:space="0" w:color="000000"/>
-                <w:top w:val="none" w:sz="0" w:space="0" w:color="000000"/>
-                <w:left w:val="none" w:sz="0" w:space="0" w:color="000000"/>
-                <w:right w:val="none" w:sz="0" w:space="0" w:color="000000"/>
-              </w:pBdr>
-              <w:spacing w:after="100" w:before="100" w:line="240"/>
-              <w:ind w:left="100" w:right="100" w:firstLine="0" w:firstLineChars="0"/>
-              <w:rPr>
-                <w:rFonts w:ascii="Helvetica" w:hAnsi="Helvetica" w:eastAsia="Helvetica" w:cs="Helvetica"/>
-                <w:i w:val="false"/>
-                <w:b w:val="false"/>
-                <w:u w:val="none"/>
-                <w:sz w:val="20"/>
-                <w:szCs w:val="20"/>
-                <w:color w:val="000000"/>
-              </w:rPr>
-            </w:pPr>
-            <w:r>
-              <w:rPr>
-                <w:rFonts w:ascii="Helvetica" w:hAnsi="Helvetica" w:eastAsia="Helvetica" w:cs="Helvetica"/>
-                <w:i w:val="false"/>
-                <w:b w:val="false"/>
-                <w:u w:val="none"/>
-                <w:sz w:val="20"/>
-                <w:szCs w:val="20"/>
-                <w:color w:val="000000"/>
-              </w:rPr>
-              <w:t xml:space="preserve">61 [40–82]</w:t>
+              <w:t xml:space="preserve"/>
             </w:r>
           </w:p>
         </w:tc>
@@ -1561,7 +1561,59 @@
                 <w:szCs w:val="20"/>
                 <w:color w:val="000000"/>
               </w:rPr>
-              <w:t xml:space="preserve">HR</w:t>
+              <w:t xml:space="preserve">IVC_repair_type: Irreparable</w:t>
+            </w:r>
+          </w:p>
+        </w:tc>
+        <w:tc>
+          <w:tcPr>
+            <w:tcBorders>
+              <w:bottom w:val="none" w:sz="0" w:space="0" w:color="000000"/>
+              <w:top w:val="none" w:sz="0" w:space="0" w:color="000000"/>
+              <w:left w:val="none" w:sz="0" w:space="0" w:color="000000"/>
+              <w:right w:val="none" w:sz="0" w:space="0" w:color="000000"/>
+            </w:tcBorders>
+            <w:shd w:val="clear" w:color="auto" w:fill="FFFFFF"/>
+            <w:tcMar>
+              <w:top w:w="0" w:type="dxa"/>
+              <w:bottom w:w="0" w:type="dxa"/>
+              <w:left w:w="0" w:type="dxa"/>
+              <w:right w:w="0" w:type="dxa"/>
+            </w:tcMar>
+            <w:vAlign w:val="center"/>
+          </w:tcPr>
+          <w:p>
+            <w:pPr>
+              <w:jc w:val="center"/>
+              <w:pBdr>
+                <w:bottom w:val="none" w:sz="0" w:space="0" w:color="000000"/>
+                <w:top w:val="none" w:sz="0" w:space="0" w:color="000000"/>
+                <w:left w:val="none" w:sz="0" w:space="0" w:color="000000"/>
+                <w:right w:val="none" w:sz="0" w:space="0" w:color="000000"/>
+              </w:pBdr>
+              <w:spacing w:after="100" w:before="100" w:line="240"/>
+              <w:ind w:left="100" w:right="100" w:firstLine="0" w:firstLineChars="0"/>
+              <w:rPr>
+                <w:rFonts w:ascii="Helvetica" w:hAnsi="Helvetica" w:eastAsia="Helvetica" w:cs="Helvetica"/>
+                <w:i w:val="false"/>
+                <w:b w:val="false"/>
+                <w:u w:val="none"/>
+                <w:sz w:val="20"/>
+                <w:szCs w:val="20"/>
+                <w:color w:val="000000"/>
+              </w:rPr>
+            </w:pPr>
+            <w:r>
+              <w:rPr>
+                <w:rFonts w:ascii="Helvetica" w:hAnsi="Helvetica" w:eastAsia="Helvetica" w:cs="Helvetica"/>
+                <w:i w:val="false"/>
+                <w:b w:val="false"/>
+                <w:u w:val="none"/>
+                <w:sz w:val="20"/>
+                <w:szCs w:val="20"/>
+                <w:color w:val="000000"/>
+              </w:rPr>
+              <w:t xml:space="preserve">19 (14%)</w:t>
             </w:r>
           </w:p>
         </w:tc>
@@ -1665,59 +1717,7 @@
                 <w:szCs w:val="20"/>
                 <w:color w:val="000000"/>
               </w:rPr>
-              <w:t xml:space="preserve">101.9 ± 37.7</w:t>
-            </w:r>
-          </w:p>
-        </w:tc>
-        <w:tc>
-          <w:tcPr>
-            <w:tcBorders>
-              <w:bottom w:val="none" w:sz="0" w:space="0" w:color="000000"/>
-              <w:top w:val="none" w:sz="0" w:space="0" w:color="000000"/>
-              <w:left w:val="none" w:sz="0" w:space="0" w:color="000000"/>
-              <w:right w:val="none" w:sz="0" w:space="0" w:color="000000"/>
-            </w:tcBorders>
-            <w:shd w:val="clear" w:color="auto" w:fill="FFFFFF"/>
-            <w:tcMar>
-              <w:top w:w="0" w:type="dxa"/>
-              <w:bottom w:w="0" w:type="dxa"/>
-              <w:left w:w="0" w:type="dxa"/>
-              <w:right w:w="0" w:type="dxa"/>
-            </w:tcMar>
-            <w:vAlign w:val="center"/>
-          </w:tcPr>
-          <w:p>
-            <w:pPr>
-              <w:jc w:val="center"/>
-              <w:pBdr>
-                <w:bottom w:val="none" w:sz="0" w:space="0" w:color="000000"/>
-                <w:top w:val="none" w:sz="0" w:space="0" w:color="000000"/>
-                <w:left w:val="none" w:sz="0" w:space="0" w:color="000000"/>
-                <w:right w:val="none" w:sz="0" w:space="0" w:color="000000"/>
-              </w:pBdr>
-              <w:spacing w:after="100" w:before="100" w:line="240"/>
-              <w:ind w:left="100" w:right="100" w:firstLine="0" w:firstLineChars="0"/>
-              <w:rPr>
-                <w:rFonts w:ascii="Helvetica" w:hAnsi="Helvetica" w:eastAsia="Helvetica" w:cs="Helvetica"/>
-                <w:i w:val="false"/>
-                <w:b w:val="false"/>
-                <w:u w:val="none"/>
-                <w:sz w:val="20"/>
-                <w:szCs w:val="20"/>
-                <w:color w:val="000000"/>
-              </w:rPr>
-            </w:pPr>
-            <w:r>
-              <w:rPr>
-                <w:rFonts w:ascii="Helvetica" w:hAnsi="Helvetica" w:eastAsia="Helvetica" w:cs="Helvetica"/>
-                <w:i w:val="false"/>
-                <w:b w:val="false"/>
-                <w:u w:val="none"/>
-                <w:sz w:val="20"/>
-                <w:szCs w:val="20"/>
-                <w:color w:val="000000"/>
-              </w:rPr>
-              <w:t xml:space="preserve">104 [84.8–129.2]</w:t>
+              <w:t xml:space="preserve"/>
             </w:r>
           </w:p>
         </w:tc>
@@ -1775,7 +1775,59 @@
                 <w:szCs w:val="20"/>
                 <w:color w:val="000000"/>
               </w:rPr>
-              <w:t xml:space="preserve">ISS</w:t>
+              <w:t xml:space="preserve">IVC_repair_type: Ligation</w:t>
+            </w:r>
+          </w:p>
+        </w:tc>
+        <w:tc>
+          <w:tcPr>
+            <w:tcBorders>
+              <w:bottom w:val="none" w:sz="0" w:space="0" w:color="000000"/>
+              <w:top w:val="none" w:sz="0" w:space="0" w:color="000000"/>
+              <w:left w:val="none" w:sz="0" w:space="0" w:color="000000"/>
+              <w:right w:val="none" w:sz="0" w:space="0" w:color="000000"/>
+            </w:tcBorders>
+            <w:shd w:val="clear" w:color="auto" w:fill="FFFFFF"/>
+            <w:tcMar>
+              <w:top w:w="0" w:type="dxa"/>
+              <w:bottom w:w="0" w:type="dxa"/>
+              <w:left w:w="0" w:type="dxa"/>
+              <w:right w:w="0" w:type="dxa"/>
+            </w:tcMar>
+            <w:vAlign w:val="center"/>
+          </w:tcPr>
+          <w:p>
+            <w:pPr>
+              <w:jc w:val="center"/>
+              <w:pBdr>
+                <w:bottom w:val="none" w:sz="0" w:space="0" w:color="000000"/>
+                <w:top w:val="none" w:sz="0" w:space="0" w:color="000000"/>
+                <w:left w:val="none" w:sz="0" w:space="0" w:color="000000"/>
+                <w:right w:val="none" w:sz="0" w:space="0" w:color="000000"/>
+              </w:pBdr>
+              <w:spacing w:after="100" w:before="100" w:line="240"/>
+              <w:ind w:left="100" w:right="100" w:firstLine="0" w:firstLineChars="0"/>
+              <w:rPr>
+                <w:rFonts w:ascii="Helvetica" w:hAnsi="Helvetica" w:eastAsia="Helvetica" w:cs="Helvetica"/>
+                <w:i w:val="false"/>
+                <w:b w:val="false"/>
+                <w:u w:val="none"/>
+                <w:sz w:val="20"/>
+                <w:szCs w:val="20"/>
+                <w:color w:val="000000"/>
+              </w:rPr>
+            </w:pPr>
+            <w:r>
+              <w:rPr>
+                <w:rFonts w:ascii="Helvetica" w:hAnsi="Helvetica" w:eastAsia="Helvetica" w:cs="Helvetica"/>
+                <w:i w:val="false"/>
+                <w:b w:val="false"/>
+                <w:u w:val="none"/>
+                <w:sz w:val="20"/>
+                <w:szCs w:val="20"/>
+                <w:color w:val="000000"/>
+              </w:rPr>
+              <w:t xml:space="preserve">30 (23%)</w:t>
             </w:r>
           </w:p>
         </w:tc>
@@ -1879,59 +1931,7 @@
                 <w:szCs w:val="20"/>
                 <w:color w:val="000000"/>
               </w:rPr>
-              <w:t xml:space="preserve">26 ± 12.4</w:t>
-            </w:r>
-          </w:p>
-        </w:tc>
-        <w:tc>
-          <w:tcPr>
-            <w:tcBorders>
-              <w:bottom w:val="none" w:sz="0" w:space="0" w:color="000000"/>
-              <w:top w:val="none" w:sz="0" w:space="0" w:color="000000"/>
-              <w:left w:val="none" w:sz="0" w:space="0" w:color="000000"/>
-              <w:right w:val="none" w:sz="0" w:space="0" w:color="000000"/>
-            </w:tcBorders>
-            <w:shd w:val="clear" w:color="auto" w:fill="FFFFFF"/>
-            <w:tcMar>
-              <w:top w:w="0" w:type="dxa"/>
-              <w:bottom w:w="0" w:type="dxa"/>
-              <w:left w:w="0" w:type="dxa"/>
-              <w:right w:w="0" w:type="dxa"/>
-            </w:tcMar>
-            <w:vAlign w:val="center"/>
-          </w:tcPr>
-          <w:p>
-            <w:pPr>
-              <w:jc w:val="center"/>
-              <w:pBdr>
-                <w:bottom w:val="none" w:sz="0" w:space="0" w:color="000000"/>
-                <w:top w:val="none" w:sz="0" w:space="0" w:color="000000"/>
-                <w:left w:val="none" w:sz="0" w:space="0" w:color="000000"/>
-                <w:right w:val="none" w:sz="0" w:space="0" w:color="000000"/>
-              </w:pBdr>
-              <w:spacing w:after="100" w:before="100" w:line="240"/>
-              <w:ind w:left="100" w:right="100" w:firstLine="0" w:firstLineChars="0"/>
-              <w:rPr>
-                <w:rFonts w:ascii="Helvetica" w:hAnsi="Helvetica" w:eastAsia="Helvetica" w:cs="Helvetica"/>
-                <w:i w:val="false"/>
-                <w:b w:val="false"/>
-                <w:u w:val="none"/>
-                <w:sz w:val="20"/>
-                <w:szCs w:val="20"/>
-                <w:color w:val="000000"/>
-              </w:rPr>
-            </w:pPr>
-            <w:r>
-              <w:rPr>
-                <w:rFonts w:ascii="Helvetica" w:hAnsi="Helvetica" w:eastAsia="Helvetica" w:cs="Helvetica"/>
-                <w:i w:val="false"/>
-                <w:b w:val="false"/>
-                <w:u w:val="none"/>
-                <w:sz w:val="20"/>
-                <w:szCs w:val="20"/>
-                <w:color w:val="000000"/>
-              </w:rPr>
-              <w:t xml:space="preserve">25 [16–33.2]</w:t>
+              <w:t xml:space="preserve"/>
             </w:r>
           </w:p>
         </w:tc>
@@ -1989,7 +1989,59 @@
                 <w:szCs w:val="20"/>
                 <w:color w:val="000000"/>
               </w:rPr>
-              <w:t xml:space="preserve">AIS_abdomen</w:t>
+              <w:t xml:space="preserve">IVC_repair_type: Patch</w:t>
+            </w:r>
+          </w:p>
+        </w:tc>
+        <w:tc>
+          <w:tcPr>
+            <w:tcBorders>
+              <w:bottom w:val="none" w:sz="0" w:space="0" w:color="000000"/>
+              <w:top w:val="none" w:sz="0" w:space="0" w:color="000000"/>
+              <w:left w:val="none" w:sz="0" w:space="0" w:color="000000"/>
+              <w:right w:val="none" w:sz="0" w:space="0" w:color="000000"/>
+            </w:tcBorders>
+            <w:shd w:val="clear" w:color="auto" w:fill="FFFFFF"/>
+            <w:tcMar>
+              <w:top w:w="0" w:type="dxa"/>
+              <w:bottom w:w="0" w:type="dxa"/>
+              <w:left w:w="0" w:type="dxa"/>
+              <w:right w:w="0" w:type="dxa"/>
+            </w:tcMar>
+            <w:vAlign w:val="center"/>
+          </w:tcPr>
+          <w:p>
+            <w:pPr>
+              <w:jc w:val="center"/>
+              <w:pBdr>
+                <w:bottom w:val="none" w:sz="0" w:space="0" w:color="000000"/>
+                <w:top w:val="none" w:sz="0" w:space="0" w:color="000000"/>
+                <w:left w:val="none" w:sz="0" w:space="0" w:color="000000"/>
+                <w:right w:val="none" w:sz="0" w:space="0" w:color="000000"/>
+              </w:pBdr>
+              <w:spacing w:after="100" w:before="100" w:line="240"/>
+              <w:ind w:left="100" w:right="100" w:firstLine="0" w:firstLineChars="0"/>
+              <w:rPr>
+                <w:rFonts w:ascii="Helvetica" w:hAnsi="Helvetica" w:eastAsia="Helvetica" w:cs="Helvetica"/>
+                <w:i w:val="false"/>
+                <w:b w:val="false"/>
+                <w:u w:val="none"/>
+                <w:sz w:val="20"/>
+                <w:szCs w:val="20"/>
+                <w:color w:val="000000"/>
+              </w:rPr>
+            </w:pPr>
+            <w:r>
+              <w:rPr>
+                <w:rFonts w:ascii="Helvetica" w:hAnsi="Helvetica" w:eastAsia="Helvetica" w:cs="Helvetica"/>
+                <w:i w:val="false"/>
+                <w:b w:val="false"/>
+                <w:u w:val="none"/>
+                <w:sz w:val="20"/>
+                <w:szCs w:val="20"/>
+                <w:color w:val="000000"/>
+              </w:rPr>
+              <w:t xml:space="preserve">7 (5%)</w:t>
             </w:r>
           </w:p>
         </w:tc>
@@ -2093,59 +2145,7 @@
                 <w:szCs w:val="20"/>
                 <w:color w:val="000000"/>
               </w:rPr>
-              <w:t xml:space="preserve">4.2 ± 0.7</w:t>
-            </w:r>
-          </w:p>
-        </w:tc>
-        <w:tc>
-          <w:tcPr>
-            <w:tcBorders>
-              <w:bottom w:val="none" w:sz="0" w:space="0" w:color="000000"/>
-              <w:top w:val="none" w:sz="0" w:space="0" w:color="000000"/>
-              <w:left w:val="none" w:sz="0" w:space="0" w:color="000000"/>
-              <w:right w:val="none" w:sz="0" w:space="0" w:color="000000"/>
-            </w:tcBorders>
-            <w:shd w:val="clear" w:color="auto" w:fill="FFFFFF"/>
-            <w:tcMar>
-              <w:top w:w="0" w:type="dxa"/>
-              <w:bottom w:w="0" w:type="dxa"/>
-              <w:left w:w="0" w:type="dxa"/>
-              <w:right w:w="0" w:type="dxa"/>
-            </w:tcMar>
-            <w:vAlign w:val="center"/>
-          </w:tcPr>
-          <w:p>
-            <w:pPr>
-              <w:jc w:val="center"/>
-              <w:pBdr>
-                <w:bottom w:val="none" w:sz="0" w:space="0" w:color="000000"/>
-                <w:top w:val="none" w:sz="0" w:space="0" w:color="000000"/>
-                <w:left w:val="none" w:sz="0" w:space="0" w:color="000000"/>
-                <w:right w:val="none" w:sz="0" w:space="0" w:color="000000"/>
-              </w:pBdr>
-              <w:spacing w:after="100" w:before="100" w:line="240"/>
-              <w:ind w:left="100" w:right="100" w:firstLine="0" w:firstLineChars="0"/>
-              <w:rPr>
-                <w:rFonts w:ascii="Helvetica" w:hAnsi="Helvetica" w:eastAsia="Helvetica" w:cs="Helvetica"/>
-                <w:i w:val="false"/>
-                <w:b w:val="false"/>
-                <w:u w:val="none"/>
-                <w:sz w:val="20"/>
-                <w:szCs w:val="20"/>
-                <w:color w:val="000000"/>
-              </w:rPr>
-            </w:pPr>
-            <w:r>
-              <w:rPr>
-                <w:rFonts w:ascii="Helvetica" w:hAnsi="Helvetica" w:eastAsia="Helvetica" w:cs="Helvetica"/>
-                <w:i w:val="false"/>
-                <w:b w:val="false"/>
-                <w:u w:val="none"/>
-                <w:sz w:val="20"/>
-                <w:szCs w:val="20"/>
-                <w:color w:val="000000"/>
-              </w:rPr>
-              <w:t xml:space="preserve">4 [4–5]</w:t>
+              <w:t xml:space="preserve"/>
             </w:r>
           </w:p>
         </w:tc>
@@ -2203,7 +2203,59 @@
                 <w:szCs w:val="20"/>
                 <w:color w:val="000000"/>
               </w:rPr>
-              <w:t xml:space="preserve">AIS_thorax</w:t>
+              <w:t xml:space="preserve">IVC_repair_type: Primary</w:t>
+            </w:r>
+          </w:p>
+        </w:tc>
+        <w:tc>
+          <w:tcPr>
+            <w:tcBorders>
+              <w:bottom w:val="none" w:sz="0" w:space="0" w:color="000000"/>
+              <w:top w:val="none" w:sz="0" w:space="0" w:color="000000"/>
+              <w:left w:val="none" w:sz="0" w:space="0" w:color="000000"/>
+              <w:right w:val="none" w:sz="0" w:space="0" w:color="000000"/>
+            </w:tcBorders>
+            <w:shd w:val="clear" w:color="auto" w:fill="FFFFFF"/>
+            <w:tcMar>
+              <w:top w:w="0" w:type="dxa"/>
+              <w:bottom w:w="0" w:type="dxa"/>
+              <w:left w:w="0" w:type="dxa"/>
+              <w:right w:w="0" w:type="dxa"/>
+            </w:tcMar>
+            <w:vAlign w:val="center"/>
+          </w:tcPr>
+          <w:p>
+            <w:pPr>
+              <w:jc w:val="center"/>
+              <w:pBdr>
+                <w:bottom w:val="none" w:sz="0" w:space="0" w:color="000000"/>
+                <w:top w:val="none" w:sz="0" w:space="0" w:color="000000"/>
+                <w:left w:val="none" w:sz="0" w:space="0" w:color="000000"/>
+                <w:right w:val="none" w:sz="0" w:space="0" w:color="000000"/>
+              </w:pBdr>
+              <w:spacing w:after="100" w:before="100" w:line="240"/>
+              <w:ind w:left="100" w:right="100" w:firstLine="0" w:firstLineChars="0"/>
+              <w:rPr>
+                <w:rFonts w:ascii="Helvetica" w:hAnsi="Helvetica" w:eastAsia="Helvetica" w:cs="Helvetica"/>
+                <w:i w:val="false"/>
+                <w:b w:val="false"/>
+                <w:u w:val="none"/>
+                <w:sz w:val="20"/>
+                <w:szCs w:val="20"/>
+                <w:color w:val="000000"/>
+              </w:rPr>
+            </w:pPr>
+            <w:r>
+              <w:rPr>
+                <w:rFonts w:ascii="Helvetica" w:hAnsi="Helvetica" w:eastAsia="Helvetica" w:cs="Helvetica"/>
+                <w:i w:val="false"/>
+                <w:b w:val="false"/>
+                <w:u w:val="none"/>
+                <w:sz w:val="20"/>
+                <w:szCs w:val="20"/>
+                <w:color w:val="000000"/>
+              </w:rPr>
+              <w:t xml:space="preserve">76 (58%)</w:t>
             </w:r>
           </w:p>
         </w:tc>
@@ -2307,59 +2359,7 @@
                 <w:szCs w:val="20"/>
                 <w:color w:val="000000"/>
               </w:rPr>
-              <w:t xml:space="preserve">3 ± 1.4</w:t>
-            </w:r>
-          </w:p>
-        </w:tc>
-        <w:tc>
-          <w:tcPr>
-            <w:tcBorders>
-              <w:bottom w:val="none" w:sz="0" w:space="0" w:color="000000"/>
-              <w:top w:val="none" w:sz="0" w:space="0" w:color="000000"/>
-              <w:left w:val="none" w:sz="0" w:space="0" w:color="000000"/>
-              <w:right w:val="none" w:sz="0" w:space="0" w:color="000000"/>
-            </w:tcBorders>
-            <w:shd w:val="clear" w:color="auto" w:fill="FFFFFF"/>
-            <w:tcMar>
-              <w:top w:w="0" w:type="dxa"/>
-              <w:bottom w:w="0" w:type="dxa"/>
-              <w:left w:w="0" w:type="dxa"/>
-              <w:right w:w="0" w:type="dxa"/>
-            </w:tcMar>
-            <w:vAlign w:val="center"/>
-          </w:tcPr>
-          <w:p>
-            <w:pPr>
-              <w:jc w:val="center"/>
-              <w:pBdr>
-                <w:bottom w:val="none" w:sz="0" w:space="0" w:color="000000"/>
-                <w:top w:val="none" w:sz="0" w:space="0" w:color="000000"/>
-                <w:left w:val="none" w:sz="0" w:space="0" w:color="000000"/>
-                <w:right w:val="none" w:sz="0" w:space="0" w:color="000000"/>
-              </w:pBdr>
-              <w:spacing w:after="100" w:before="100" w:line="240"/>
-              <w:ind w:left="100" w:right="100" w:firstLine="0" w:firstLineChars="0"/>
-              <w:rPr>
-                <w:rFonts w:ascii="Helvetica" w:hAnsi="Helvetica" w:eastAsia="Helvetica" w:cs="Helvetica"/>
-                <w:i w:val="false"/>
-                <w:b w:val="false"/>
-                <w:u w:val="none"/>
-                <w:sz w:val="20"/>
-                <w:szCs w:val="20"/>
-                <w:color w:val="000000"/>
-              </w:rPr>
-            </w:pPr>
-            <w:r>
-              <w:rPr>
-                <w:rFonts w:ascii="Helvetica" w:hAnsi="Helvetica" w:eastAsia="Helvetica" w:cs="Helvetica"/>
-                <w:i w:val="false"/>
-                <w:b w:val="false"/>
-                <w:u w:val="none"/>
-                <w:sz w:val="20"/>
-                <w:szCs w:val="20"/>
-                <w:color w:val="000000"/>
-              </w:rPr>
-              <w:t xml:space="preserve">3 [2–4]</w:t>
+              <w:t xml:space="preserve"/>
             </w:r>
           </w:p>
         </w:tc>
@@ -2417,7 +2417,7 @@
                 <w:szCs w:val="20"/>
                 <w:color w:val="000000"/>
               </w:rPr>
-              <w:t xml:space="preserve">AIS_spine</w:t>
+              <w:t xml:space="preserve">SBP</w:t>
             </w:r>
           </w:p>
         </w:tc>
@@ -2521,59 +2521,59 @@
                 <w:szCs w:val="20"/>
                 <w:color w:val="000000"/>
               </w:rPr>
-              <w:t xml:space="preserve">2.5 ± 1</w:t>
-            </w:r>
-          </w:p>
-        </w:tc>
-        <w:tc>
-          <w:tcPr>
-            <w:tcBorders>
-              <w:bottom w:val="none" w:sz="0" w:space="0" w:color="000000"/>
-              <w:top w:val="none" w:sz="0" w:space="0" w:color="000000"/>
-              <w:left w:val="none" w:sz="0" w:space="0" w:color="000000"/>
-              <w:right w:val="none" w:sz="0" w:space="0" w:color="000000"/>
-            </w:tcBorders>
-            <w:shd w:val="clear" w:color="auto" w:fill="FFFFFF"/>
-            <w:tcMar>
-              <w:top w:w="0" w:type="dxa"/>
-              <w:bottom w:w="0" w:type="dxa"/>
-              <w:left w:w="0" w:type="dxa"/>
-              <w:right w:w="0" w:type="dxa"/>
-            </w:tcMar>
-            <w:vAlign w:val="center"/>
-          </w:tcPr>
-          <w:p>
-            <w:pPr>
-              <w:jc w:val="center"/>
-              <w:pBdr>
-                <w:bottom w:val="none" w:sz="0" w:space="0" w:color="000000"/>
-                <w:top w:val="none" w:sz="0" w:space="0" w:color="000000"/>
-                <w:left w:val="none" w:sz="0" w:space="0" w:color="000000"/>
-                <w:right w:val="none" w:sz="0" w:space="0" w:color="000000"/>
-              </w:pBdr>
-              <w:spacing w:after="100" w:before="100" w:line="240"/>
-              <w:ind w:left="100" w:right="100" w:firstLine="0" w:firstLineChars="0"/>
-              <w:rPr>
-                <w:rFonts w:ascii="Helvetica" w:hAnsi="Helvetica" w:eastAsia="Helvetica" w:cs="Helvetica"/>
-                <w:i w:val="false"/>
-                <w:b w:val="false"/>
-                <w:u w:val="none"/>
-                <w:sz w:val="20"/>
-                <w:szCs w:val="20"/>
-                <w:color w:val="000000"/>
-              </w:rPr>
-            </w:pPr>
-            <w:r>
-              <w:rPr>
-                <w:rFonts w:ascii="Helvetica" w:hAnsi="Helvetica" w:eastAsia="Helvetica" w:cs="Helvetica"/>
-                <w:i w:val="false"/>
-                <w:b w:val="false"/>
-                <w:u w:val="none"/>
-                <w:sz w:val="20"/>
-                <w:szCs w:val="20"/>
-                <w:color w:val="000000"/>
-              </w:rPr>
-              <w:t xml:space="preserve">2 [2–2]</w:t>
+              <w:t xml:space="preserve">98 ± 37.7</w:t>
+            </w:r>
+          </w:p>
+        </w:tc>
+        <w:tc>
+          <w:tcPr>
+            <w:tcBorders>
+              <w:bottom w:val="none" w:sz="0" w:space="0" w:color="000000"/>
+              <w:top w:val="none" w:sz="0" w:space="0" w:color="000000"/>
+              <w:left w:val="none" w:sz="0" w:space="0" w:color="000000"/>
+              <w:right w:val="none" w:sz="0" w:space="0" w:color="000000"/>
+            </w:tcBorders>
+            <w:shd w:val="clear" w:color="auto" w:fill="FFFFFF"/>
+            <w:tcMar>
+              <w:top w:w="0" w:type="dxa"/>
+              <w:bottom w:w="0" w:type="dxa"/>
+              <w:left w:w="0" w:type="dxa"/>
+              <w:right w:w="0" w:type="dxa"/>
+            </w:tcMar>
+            <w:vAlign w:val="center"/>
+          </w:tcPr>
+          <w:p>
+            <w:pPr>
+              <w:jc w:val="center"/>
+              <w:pBdr>
+                <w:bottom w:val="none" w:sz="0" w:space="0" w:color="000000"/>
+                <w:top w:val="none" w:sz="0" w:space="0" w:color="000000"/>
+                <w:left w:val="none" w:sz="0" w:space="0" w:color="000000"/>
+                <w:right w:val="none" w:sz="0" w:space="0" w:color="000000"/>
+              </w:pBdr>
+              <w:spacing w:after="100" w:before="100" w:line="240"/>
+              <w:ind w:left="100" w:right="100" w:firstLine="0" w:firstLineChars="0"/>
+              <w:rPr>
+                <w:rFonts w:ascii="Helvetica" w:hAnsi="Helvetica" w:eastAsia="Helvetica" w:cs="Helvetica"/>
+                <w:i w:val="false"/>
+                <w:b w:val="false"/>
+                <w:u w:val="none"/>
+                <w:sz w:val="20"/>
+                <w:szCs w:val="20"/>
+                <w:color w:val="000000"/>
+              </w:rPr>
+            </w:pPr>
+            <w:r>
+              <w:rPr>
+                <w:rFonts w:ascii="Helvetica" w:hAnsi="Helvetica" w:eastAsia="Helvetica" w:cs="Helvetica"/>
+                <w:i w:val="false"/>
+                <w:b w:val="false"/>
+                <w:u w:val="none"/>
+                <w:sz w:val="20"/>
+                <w:szCs w:val="20"/>
+                <w:color w:val="000000"/>
+              </w:rPr>
+              <w:t xml:space="preserve">101 [80–125.8]</w:t>
             </w:r>
           </w:p>
         </w:tc>
@@ -2631,7 +2631,7 @@
                 <w:szCs w:val="20"/>
                 <w:color w:val="000000"/>
               </w:rPr>
-              <w:t xml:space="preserve">hospital_days</w:t>
+              <w:t xml:space="preserve">DBP</w:t>
             </w:r>
           </w:p>
         </w:tc>
@@ -2735,59 +2735,59 @@
                 <w:szCs w:val="20"/>
                 <w:color w:val="000000"/>
               </w:rPr>
-              <w:t xml:space="preserve">30.4 ± 34.7</w:t>
-            </w:r>
-          </w:p>
-        </w:tc>
-        <w:tc>
-          <w:tcPr>
-            <w:tcBorders>
-              <w:bottom w:val="none" w:sz="0" w:space="0" w:color="000000"/>
-              <w:top w:val="none" w:sz="0" w:space="0" w:color="000000"/>
-              <w:left w:val="none" w:sz="0" w:space="0" w:color="000000"/>
-              <w:right w:val="none" w:sz="0" w:space="0" w:color="000000"/>
-            </w:tcBorders>
-            <w:shd w:val="clear" w:color="auto" w:fill="FFFFFF"/>
-            <w:tcMar>
-              <w:top w:w="0" w:type="dxa"/>
-              <w:bottom w:w="0" w:type="dxa"/>
-              <w:left w:w="0" w:type="dxa"/>
-              <w:right w:w="0" w:type="dxa"/>
-            </w:tcMar>
-            <w:vAlign w:val="center"/>
-          </w:tcPr>
-          <w:p>
-            <w:pPr>
-              <w:jc w:val="center"/>
-              <w:pBdr>
-                <w:bottom w:val="none" w:sz="0" w:space="0" w:color="000000"/>
-                <w:top w:val="none" w:sz="0" w:space="0" w:color="000000"/>
-                <w:left w:val="none" w:sz="0" w:space="0" w:color="000000"/>
-                <w:right w:val="none" w:sz="0" w:space="0" w:color="000000"/>
-              </w:pBdr>
-              <w:spacing w:after="100" w:before="100" w:line="240"/>
-              <w:ind w:left="100" w:right="100" w:firstLine="0" w:firstLineChars="0"/>
-              <w:rPr>
-                <w:rFonts w:ascii="Helvetica" w:hAnsi="Helvetica" w:eastAsia="Helvetica" w:cs="Helvetica"/>
-                <w:i w:val="false"/>
-                <w:b w:val="false"/>
-                <w:u w:val="none"/>
-                <w:sz w:val="20"/>
-                <w:szCs w:val="20"/>
-                <w:color w:val="000000"/>
-              </w:rPr>
-            </w:pPr>
-            <w:r>
-              <w:rPr>
-                <w:rFonts w:ascii="Helvetica" w:hAnsi="Helvetica" w:eastAsia="Helvetica" w:cs="Helvetica"/>
-                <w:i w:val="false"/>
-                <w:b w:val="false"/>
-                <w:u w:val="none"/>
-                <w:sz w:val="20"/>
-                <w:szCs w:val="20"/>
-                <w:color w:val="000000"/>
-              </w:rPr>
-              <w:t xml:space="preserve">21 [13.2–36]</w:t>
+              <w:t xml:space="preserve">57.8 ± 34.2</w:t>
+            </w:r>
+          </w:p>
+        </w:tc>
+        <w:tc>
+          <w:tcPr>
+            <w:tcBorders>
+              <w:bottom w:val="none" w:sz="0" w:space="0" w:color="000000"/>
+              <w:top w:val="none" w:sz="0" w:space="0" w:color="000000"/>
+              <w:left w:val="none" w:sz="0" w:space="0" w:color="000000"/>
+              <w:right w:val="none" w:sz="0" w:space="0" w:color="000000"/>
+            </w:tcBorders>
+            <w:shd w:val="clear" w:color="auto" w:fill="FFFFFF"/>
+            <w:tcMar>
+              <w:top w:w="0" w:type="dxa"/>
+              <w:bottom w:w="0" w:type="dxa"/>
+              <w:left w:w="0" w:type="dxa"/>
+              <w:right w:w="0" w:type="dxa"/>
+            </w:tcMar>
+            <w:vAlign w:val="center"/>
+          </w:tcPr>
+          <w:p>
+            <w:pPr>
+              <w:jc w:val="center"/>
+              <w:pBdr>
+                <w:bottom w:val="none" w:sz="0" w:space="0" w:color="000000"/>
+                <w:top w:val="none" w:sz="0" w:space="0" w:color="000000"/>
+                <w:left w:val="none" w:sz="0" w:space="0" w:color="000000"/>
+                <w:right w:val="none" w:sz="0" w:space="0" w:color="000000"/>
+              </w:pBdr>
+              <w:spacing w:after="100" w:before="100" w:line="240"/>
+              <w:ind w:left="100" w:right="100" w:firstLine="0" w:firstLineChars="0"/>
+              <w:rPr>
+                <w:rFonts w:ascii="Helvetica" w:hAnsi="Helvetica" w:eastAsia="Helvetica" w:cs="Helvetica"/>
+                <w:i w:val="false"/>
+                <w:b w:val="false"/>
+                <w:u w:val="none"/>
+                <w:sz w:val="20"/>
+                <w:szCs w:val="20"/>
+                <w:color w:val="000000"/>
+              </w:rPr>
+            </w:pPr>
+            <w:r>
+              <w:rPr>
+                <w:rFonts w:ascii="Helvetica" w:hAnsi="Helvetica" w:eastAsia="Helvetica" w:cs="Helvetica"/>
+                <w:i w:val="false"/>
+                <w:b w:val="false"/>
+                <w:u w:val="none"/>
+                <w:sz w:val="20"/>
+                <w:szCs w:val="20"/>
+                <w:color w:val="000000"/>
+              </w:rPr>
+              <w:t xml:space="preserve">61 [40–82]</w:t>
             </w:r>
           </w:p>
         </w:tc>
@@ -2845,7 +2845,7 @@
                 <w:szCs w:val="20"/>
                 <w:color w:val="000000"/>
               </w:rPr>
-              <w:t xml:space="preserve">ICU_days</w:t>
+              <w:t xml:space="preserve">HR</w:t>
             </w:r>
           </w:p>
         </w:tc>
@@ -2949,59 +2949,59 @@
                 <w:szCs w:val="20"/>
                 <w:color w:val="000000"/>
               </w:rPr>
-              <w:t xml:space="preserve">15.8 ± 18.8</w:t>
-            </w:r>
-          </w:p>
-        </w:tc>
-        <w:tc>
-          <w:tcPr>
-            <w:tcBorders>
-              <w:bottom w:val="none" w:sz="0" w:space="0" w:color="000000"/>
-              <w:top w:val="none" w:sz="0" w:space="0" w:color="000000"/>
-              <w:left w:val="none" w:sz="0" w:space="0" w:color="000000"/>
-              <w:right w:val="none" w:sz="0" w:space="0" w:color="000000"/>
-            </w:tcBorders>
-            <w:shd w:val="clear" w:color="auto" w:fill="FFFFFF"/>
-            <w:tcMar>
-              <w:top w:w="0" w:type="dxa"/>
-              <w:bottom w:w="0" w:type="dxa"/>
-              <w:left w:w="0" w:type="dxa"/>
-              <w:right w:w="0" w:type="dxa"/>
-            </w:tcMar>
-            <w:vAlign w:val="center"/>
-          </w:tcPr>
-          <w:p>
-            <w:pPr>
-              <w:jc w:val="center"/>
-              <w:pBdr>
-                <w:bottom w:val="none" w:sz="0" w:space="0" w:color="000000"/>
-                <w:top w:val="none" w:sz="0" w:space="0" w:color="000000"/>
-                <w:left w:val="none" w:sz="0" w:space="0" w:color="000000"/>
-                <w:right w:val="none" w:sz="0" w:space="0" w:color="000000"/>
-              </w:pBdr>
-              <w:spacing w:after="100" w:before="100" w:line="240"/>
-              <w:ind w:left="100" w:right="100" w:firstLine="0" w:firstLineChars="0"/>
-              <w:rPr>
-                <w:rFonts w:ascii="Helvetica" w:hAnsi="Helvetica" w:eastAsia="Helvetica" w:cs="Helvetica"/>
-                <w:i w:val="false"/>
-                <w:b w:val="false"/>
-                <w:u w:val="none"/>
-                <w:sz w:val="20"/>
-                <w:szCs w:val="20"/>
-                <w:color w:val="000000"/>
-              </w:rPr>
-            </w:pPr>
-            <w:r>
-              <w:rPr>
-                <w:rFonts w:ascii="Helvetica" w:hAnsi="Helvetica" w:eastAsia="Helvetica" w:cs="Helvetica"/>
-                <w:i w:val="false"/>
-                <w:b w:val="false"/>
-                <w:u w:val="none"/>
-                <w:sz w:val="20"/>
-                <w:szCs w:val="20"/>
-                <w:color w:val="000000"/>
-              </w:rPr>
-              <w:t xml:space="preserve">7 [4–22]</w:t>
+              <w:t xml:space="preserve">101.9 ± 37.7</w:t>
+            </w:r>
+          </w:p>
+        </w:tc>
+        <w:tc>
+          <w:tcPr>
+            <w:tcBorders>
+              <w:bottom w:val="none" w:sz="0" w:space="0" w:color="000000"/>
+              <w:top w:val="none" w:sz="0" w:space="0" w:color="000000"/>
+              <w:left w:val="none" w:sz="0" w:space="0" w:color="000000"/>
+              <w:right w:val="none" w:sz="0" w:space="0" w:color="000000"/>
+            </w:tcBorders>
+            <w:shd w:val="clear" w:color="auto" w:fill="FFFFFF"/>
+            <w:tcMar>
+              <w:top w:w="0" w:type="dxa"/>
+              <w:bottom w:w="0" w:type="dxa"/>
+              <w:left w:w="0" w:type="dxa"/>
+              <w:right w:w="0" w:type="dxa"/>
+            </w:tcMar>
+            <w:vAlign w:val="center"/>
+          </w:tcPr>
+          <w:p>
+            <w:pPr>
+              <w:jc w:val="center"/>
+              <w:pBdr>
+                <w:bottom w:val="none" w:sz="0" w:space="0" w:color="000000"/>
+                <w:top w:val="none" w:sz="0" w:space="0" w:color="000000"/>
+                <w:left w:val="none" w:sz="0" w:space="0" w:color="000000"/>
+                <w:right w:val="none" w:sz="0" w:space="0" w:color="000000"/>
+              </w:pBdr>
+              <w:spacing w:after="100" w:before="100" w:line="240"/>
+              <w:ind w:left="100" w:right="100" w:firstLine="0" w:firstLineChars="0"/>
+              <w:rPr>
+                <w:rFonts w:ascii="Helvetica" w:hAnsi="Helvetica" w:eastAsia="Helvetica" w:cs="Helvetica"/>
+                <w:i w:val="false"/>
+                <w:b w:val="false"/>
+                <w:u w:val="none"/>
+                <w:sz w:val="20"/>
+                <w:szCs w:val="20"/>
+                <w:color w:val="000000"/>
+              </w:rPr>
+            </w:pPr>
+            <w:r>
+              <w:rPr>
+                <w:rFonts w:ascii="Helvetica" w:hAnsi="Helvetica" w:eastAsia="Helvetica" w:cs="Helvetica"/>
+                <w:i w:val="false"/>
+                <w:b w:val="false"/>
+                <w:u w:val="none"/>
+                <w:sz w:val="20"/>
+                <w:szCs w:val="20"/>
+                <w:color w:val="000000"/>
+              </w:rPr>
+              <w:t xml:space="preserve">104 [84.8–129.2]</w:t>
             </w:r>
           </w:p>
         </w:tc>
@@ -3059,7 +3059,7 @@
                 <w:szCs w:val="20"/>
                 <w:color w:val="000000"/>
               </w:rPr>
-              <w:t xml:space="preserve">vent_days</w:t>
+              <w:t xml:space="preserve">ISS</w:t>
             </w:r>
           </w:p>
         </w:tc>
@@ -3163,59 +3163,59 @@
                 <w:szCs w:val="20"/>
                 <w:color w:val="000000"/>
               </w:rPr>
-              <w:t xml:space="preserve">9.4 ± 13.4</w:t>
-            </w:r>
-          </w:p>
-        </w:tc>
-        <w:tc>
-          <w:tcPr>
-            <w:tcBorders>
-              <w:bottom w:val="none" w:sz="0" w:space="0" w:color="000000"/>
-              <w:top w:val="none" w:sz="0" w:space="0" w:color="000000"/>
-              <w:left w:val="none" w:sz="0" w:space="0" w:color="000000"/>
-              <w:right w:val="none" w:sz="0" w:space="0" w:color="000000"/>
-            </w:tcBorders>
-            <w:shd w:val="clear" w:color="auto" w:fill="FFFFFF"/>
-            <w:tcMar>
-              <w:top w:w="0" w:type="dxa"/>
-              <w:bottom w:w="0" w:type="dxa"/>
-              <w:left w:w="0" w:type="dxa"/>
-              <w:right w:w="0" w:type="dxa"/>
-            </w:tcMar>
-            <w:vAlign w:val="center"/>
-          </w:tcPr>
-          <w:p>
-            <w:pPr>
-              <w:jc w:val="center"/>
-              <w:pBdr>
-                <w:bottom w:val="none" w:sz="0" w:space="0" w:color="000000"/>
-                <w:top w:val="none" w:sz="0" w:space="0" w:color="000000"/>
-                <w:left w:val="none" w:sz="0" w:space="0" w:color="000000"/>
-                <w:right w:val="none" w:sz="0" w:space="0" w:color="000000"/>
-              </w:pBdr>
-              <w:spacing w:after="100" w:before="100" w:line="240"/>
-              <w:ind w:left="100" w:right="100" w:firstLine="0" w:firstLineChars="0"/>
-              <w:rPr>
-                <w:rFonts w:ascii="Helvetica" w:hAnsi="Helvetica" w:eastAsia="Helvetica" w:cs="Helvetica"/>
-                <w:i w:val="false"/>
-                <w:b w:val="false"/>
-                <w:u w:val="none"/>
-                <w:sz w:val="20"/>
-                <w:szCs w:val="20"/>
-                <w:color w:val="000000"/>
-              </w:rPr>
-            </w:pPr>
-            <w:r>
-              <w:rPr>
-                <w:rFonts w:ascii="Helvetica" w:hAnsi="Helvetica" w:eastAsia="Helvetica" w:cs="Helvetica"/>
-                <w:i w:val="false"/>
-                <w:b w:val="false"/>
-                <w:u w:val="none"/>
-                <w:sz w:val="20"/>
-                <w:szCs w:val="20"/>
-                <w:color w:val="000000"/>
-              </w:rPr>
-              <w:t xml:space="preserve">3 [2–8]</w:t>
+              <w:t xml:space="preserve">26 ± 12.4</w:t>
+            </w:r>
+          </w:p>
+        </w:tc>
+        <w:tc>
+          <w:tcPr>
+            <w:tcBorders>
+              <w:bottom w:val="none" w:sz="0" w:space="0" w:color="000000"/>
+              <w:top w:val="none" w:sz="0" w:space="0" w:color="000000"/>
+              <w:left w:val="none" w:sz="0" w:space="0" w:color="000000"/>
+              <w:right w:val="none" w:sz="0" w:space="0" w:color="000000"/>
+            </w:tcBorders>
+            <w:shd w:val="clear" w:color="auto" w:fill="FFFFFF"/>
+            <w:tcMar>
+              <w:top w:w="0" w:type="dxa"/>
+              <w:bottom w:w="0" w:type="dxa"/>
+              <w:left w:w="0" w:type="dxa"/>
+              <w:right w:w="0" w:type="dxa"/>
+            </w:tcMar>
+            <w:vAlign w:val="center"/>
+          </w:tcPr>
+          <w:p>
+            <w:pPr>
+              <w:jc w:val="center"/>
+              <w:pBdr>
+                <w:bottom w:val="none" w:sz="0" w:space="0" w:color="000000"/>
+                <w:top w:val="none" w:sz="0" w:space="0" w:color="000000"/>
+                <w:left w:val="none" w:sz="0" w:space="0" w:color="000000"/>
+                <w:right w:val="none" w:sz="0" w:space="0" w:color="000000"/>
+              </w:pBdr>
+              <w:spacing w:after="100" w:before="100" w:line="240"/>
+              <w:ind w:left="100" w:right="100" w:firstLine="0" w:firstLineChars="0"/>
+              <w:rPr>
+                <w:rFonts w:ascii="Helvetica" w:hAnsi="Helvetica" w:eastAsia="Helvetica" w:cs="Helvetica"/>
+                <w:i w:val="false"/>
+                <w:b w:val="false"/>
+                <w:u w:val="none"/>
+                <w:sz w:val="20"/>
+                <w:szCs w:val="20"/>
+                <w:color w:val="000000"/>
+              </w:rPr>
+            </w:pPr>
+            <w:r>
+              <w:rPr>
+                <w:rFonts w:ascii="Helvetica" w:hAnsi="Helvetica" w:eastAsia="Helvetica" w:cs="Helvetica"/>
+                <w:i w:val="false"/>
+                <w:b w:val="false"/>
+                <w:u w:val="none"/>
+                <w:sz w:val="20"/>
+                <w:szCs w:val="20"/>
+                <w:color w:val="000000"/>
+              </w:rPr>
+              <w:t xml:space="preserve">25 [16–33.2]</w:t>
             </w:r>
           </w:p>
         </w:tc>
@@ -3273,59 +3273,7 @@
                 <w:szCs w:val="20"/>
                 <w:color w:val="000000"/>
               </w:rPr>
-              <w:t xml:space="preserve">readmission_wi_30d: N</w:t>
-            </w:r>
-          </w:p>
-        </w:tc>
-        <w:tc>
-          <w:tcPr>
-            <w:tcBorders>
-              <w:bottom w:val="none" w:sz="0" w:space="0" w:color="000000"/>
-              <w:top w:val="none" w:sz="0" w:space="0" w:color="000000"/>
-              <w:left w:val="none" w:sz="0" w:space="0" w:color="000000"/>
-              <w:right w:val="none" w:sz="0" w:space="0" w:color="000000"/>
-            </w:tcBorders>
-            <w:shd w:val="clear" w:color="auto" w:fill="FFFFFF"/>
-            <w:tcMar>
-              <w:top w:w="0" w:type="dxa"/>
-              <w:bottom w:w="0" w:type="dxa"/>
-              <w:left w:w="0" w:type="dxa"/>
-              <w:right w:w="0" w:type="dxa"/>
-            </w:tcMar>
-            <w:vAlign w:val="center"/>
-          </w:tcPr>
-          <w:p>
-            <w:pPr>
-              <w:jc w:val="center"/>
-              <w:pBdr>
-                <w:bottom w:val="none" w:sz="0" w:space="0" w:color="000000"/>
-                <w:top w:val="none" w:sz="0" w:space="0" w:color="000000"/>
-                <w:left w:val="none" w:sz="0" w:space="0" w:color="000000"/>
-                <w:right w:val="none" w:sz="0" w:space="0" w:color="000000"/>
-              </w:pBdr>
-              <w:spacing w:after="100" w:before="100" w:line="240"/>
-              <w:ind w:left="100" w:right="100" w:firstLine="0" w:firstLineChars="0"/>
-              <w:rPr>
-                <w:rFonts w:ascii="Helvetica" w:hAnsi="Helvetica" w:eastAsia="Helvetica" w:cs="Helvetica"/>
-                <w:i w:val="false"/>
-                <w:b w:val="false"/>
-                <w:u w:val="none"/>
-                <w:sz w:val="20"/>
-                <w:szCs w:val="20"/>
-                <w:color w:val="000000"/>
-              </w:rPr>
-            </w:pPr>
-            <w:r>
-              <w:rPr>
-                <w:rFonts w:ascii="Helvetica" w:hAnsi="Helvetica" w:eastAsia="Helvetica" w:cs="Helvetica"/>
-                <w:i w:val="false"/>
-                <w:b w:val="false"/>
-                <w:u w:val="none"/>
-                <w:sz w:val="20"/>
-                <w:szCs w:val="20"/>
-                <w:color w:val="000000"/>
-              </w:rPr>
-              <w:t xml:space="preserve">63 (85%)</w:t>
+              <w:t xml:space="preserve">AIS_abdomen</w:t>
             </w:r>
           </w:p>
         </w:tc>
@@ -3429,7 +3377,59 @@
                 <w:szCs w:val="20"/>
                 <w:color w:val="000000"/>
               </w:rPr>
-              <w:t xml:space="preserve"/>
+              <w:t xml:space="preserve">4.2 ± 0.7</w:t>
+            </w:r>
+          </w:p>
+        </w:tc>
+        <w:tc>
+          <w:tcPr>
+            <w:tcBorders>
+              <w:bottom w:val="none" w:sz="0" w:space="0" w:color="000000"/>
+              <w:top w:val="none" w:sz="0" w:space="0" w:color="000000"/>
+              <w:left w:val="none" w:sz="0" w:space="0" w:color="000000"/>
+              <w:right w:val="none" w:sz="0" w:space="0" w:color="000000"/>
+            </w:tcBorders>
+            <w:shd w:val="clear" w:color="auto" w:fill="FFFFFF"/>
+            <w:tcMar>
+              <w:top w:w="0" w:type="dxa"/>
+              <w:bottom w:w="0" w:type="dxa"/>
+              <w:left w:w="0" w:type="dxa"/>
+              <w:right w:w="0" w:type="dxa"/>
+            </w:tcMar>
+            <w:vAlign w:val="center"/>
+          </w:tcPr>
+          <w:p>
+            <w:pPr>
+              <w:jc w:val="center"/>
+              <w:pBdr>
+                <w:bottom w:val="none" w:sz="0" w:space="0" w:color="000000"/>
+                <w:top w:val="none" w:sz="0" w:space="0" w:color="000000"/>
+                <w:left w:val="none" w:sz="0" w:space="0" w:color="000000"/>
+                <w:right w:val="none" w:sz="0" w:space="0" w:color="000000"/>
+              </w:pBdr>
+              <w:spacing w:after="100" w:before="100" w:line="240"/>
+              <w:ind w:left="100" w:right="100" w:firstLine="0" w:firstLineChars="0"/>
+              <w:rPr>
+                <w:rFonts w:ascii="Helvetica" w:hAnsi="Helvetica" w:eastAsia="Helvetica" w:cs="Helvetica"/>
+                <w:i w:val="false"/>
+                <w:b w:val="false"/>
+                <w:u w:val="none"/>
+                <w:sz w:val="20"/>
+                <w:szCs w:val="20"/>
+                <w:color w:val="000000"/>
+              </w:rPr>
+            </w:pPr>
+            <w:r>
+              <w:rPr>
+                <w:rFonts w:ascii="Helvetica" w:hAnsi="Helvetica" w:eastAsia="Helvetica" w:cs="Helvetica"/>
+                <w:i w:val="false"/>
+                <w:b w:val="false"/>
+                <w:u w:val="none"/>
+                <w:sz w:val="20"/>
+                <w:szCs w:val="20"/>
+                <w:color w:val="000000"/>
+              </w:rPr>
+              <w:t xml:space="preserve">4 [4–5]</w:t>
             </w:r>
           </w:p>
         </w:tc>
@@ -3439,6 +3439,1504 @@
           <w:trHeight w:val="360" w:hRule="auto"/>
         </w:trPr>
         body16
+        <w:tc>
+          <w:tcPr>
+            <w:tcBorders>
+              <w:bottom w:val="none" w:sz="0" w:space="0" w:color="000000"/>
+              <w:top w:val="none" w:sz="0" w:space="0" w:color="000000"/>
+              <w:left w:val="none" w:sz="0" w:space="0" w:color="000000"/>
+              <w:right w:val="none" w:sz="0" w:space="0" w:color="000000"/>
+            </w:tcBorders>
+            <w:shd w:val="clear" w:color="auto" w:fill="FFFFFF"/>
+            <w:tcMar>
+              <w:top w:w="0" w:type="dxa"/>
+              <w:bottom w:w="0" w:type="dxa"/>
+              <w:left w:w="0" w:type="dxa"/>
+              <w:right w:w="0" w:type="dxa"/>
+            </w:tcMar>
+            <w:vAlign w:val="center"/>
+          </w:tcPr>
+          <w:p>
+            <w:pPr>
+              <w:jc w:val="left"/>
+              <w:pBdr>
+                <w:bottom w:val="none" w:sz="0" w:space="0" w:color="000000"/>
+                <w:top w:val="none" w:sz="0" w:space="0" w:color="000000"/>
+                <w:left w:val="none" w:sz="0" w:space="0" w:color="000000"/>
+                <w:right w:val="none" w:sz="0" w:space="0" w:color="000000"/>
+              </w:pBdr>
+              <w:spacing w:after="100" w:before="100" w:line="240"/>
+              <w:ind w:left="100" w:right="100" w:firstLine="0" w:firstLineChars="0"/>
+              <w:rPr>
+                <w:rFonts w:ascii="Helvetica" w:hAnsi="Helvetica" w:eastAsia="Helvetica" w:cs="Helvetica"/>
+                <w:i w:val="false"/>
+                <w:b w:val="false"/>
+                <w:u w:val="none"/>
+                <w:sz w:val="20"/>
+                <w:szCs w:val="20"/>
+                <w:color w:val="000000"/>
+              </w:rPr>
+            </w:pPr>
+            <w:r>
+              <w:rPr>
+                <w:rFonts w:ascii="Helvetica" w:hAnsi="Helvetica" w:eastAsia="Helvetica" w:cs="Helvetica"/>
+                <w:i w:val="false"/>
+                <w:b w:val="false"/>
+                <w:u w:val="none"/>
+                <w:sz w:val="20"/>
+                <w:szCs w:val="20"/>
+                <w:color w:val="000000"/>
+              </w:rPr>
+              <w:t xml:space="preserve">AIS_thorax</w:t>
+            </w:r>
+          </w:p>
+        </w:tc>
+        <w:tc>
+          <w:tcPr>
+            <w:tcBorders>
+              <w:bottom w:val="none" w:sz="0" w:space="0" w:color="000000"/>
+              <w:top w:val="none" w:sz="0" w:space="0" w:color="000000"/>
+              <w:left w:val="none" w:sz="0" w:space="0" w:color="000000"/>
+              <w:right w:val="none" w:sz="0" w:space="0" w:color="000000"/>
+            </w:tcBorders>
+            <w:shd w:val="clear" w:color="auto" w:fill="FFFFFF"/>
+            <w:tcMar>
+              <w:top w:w="0" w:type="dxa"/>
+              <w:bottom w:w="0" w:type="dxa"/>
+              <w:left w:w="0" w:type="dxa"/>
+              <w:right w:w="0" w:type="dxa"/>
+            </w:tcMar>
+            <w:vAlign w:val="center"/>
+          </w:tcPr>
+          <w:p>
+            <w:pPr>
+              <w:jc w:val="center"/>
+              <w:pBdr>
+                <w:bottom w:val="none" w:sz="0" w:space="0" w:color="000000"/>
+                <w:top w:val="none" w:sz="0" w:space="0" w:color="000000"/>
+                <w:left w:val="none" w:sz="0" w:space="0" w:color="000000"/>
+                <w:right w:val="none" w:sz="0" w:space="0" w:color="000000"/>
+              </w:pBdr>
+              <w:spacing w:after="100" w:before="100" w:line="240"/>
+              <w:ind w:left="100" w:right="100" w:firstLine="0" w:firstLineChars="0"/>
+              <w:rPr>
+                <w:rFonts w:ascii="Helvetica" w:hAnsi="Helvetica" w:eastAsia="Helvetica" w:cs="Helvetica"/>
+                <w:i w:val="false"/>
+                <w:b w:val="false"/>
+                <w:u w:val="none"/>
+                <w:sz w:val="20"/>
+                <w:szCs w:val="20"/>
+                <w:color w:val="000000"/>
+              </w:rPr>
+            </w:pPr>
+            <w:r>
+              <w:rPr>
+                <w:rFonts w:ascii="Helvetica" w:hAnsi="Helvetica" w:eastAsia="Helvetica" w:cs="Helvetica"/>
+                <w:i w:val="false"/>
+                <w:b w:val="false"/>
+                <w:u w:val="none"/>
+                <w:sz w:val="20"/>
+                <w:szCs w:val="20"/>
+                <w:color w:val="000000"/>
+              </w:rPr>
+              <w:t xml:space="preserve"/>
+            </w:r>
+          </w:p>
+        </w:tc>
+        <w:tc>
+          <w:tcPr>
+            <w:tcBorders>
+              <w:bottom w:val="none" w:sz="0" w:space="0" w:color="000000"/>
+              <w:top w:val="none" w:sz="0" w:space="0" w:color="000000"/>
+              <w:left w:val="none" w:sz="0" w:space="0" w:color="000000"/>
+              <w:right w:val="none" w:sz="0" w:space="0" w:color="000000"/>
+            </w:tcBorders>
+            <w:shd w:val="clear" w:color="auto" w:fill="FFFFFF"/>
+            <w:tcMar>
+              <w:top w:w="0" w:type="dxa"/>
+              <w:bottom w:w="0" w:type="dxa"/>
+              <w:left w:w="0" w:type="dxa"/>
+              <w:right w:w="0" w:type="dxa"/>
+            </w:tcMar>
+            <w:vAlign w:val="center"/>
+          </w:tcPr>
+          <w:p>
+            <w:pPr>
+              <w:jc w:val="center"/>
+              <w:pBdr>
+                <w:bottom w:val="none" w:sz="0" w:space="0" w:color="000000"/>
+                <w:top w:val="none" w:sz="0" w:space="0" w:color="000000"/>
+                <w:left w:val="none" w:sz="0" w:space="0" w:color="000000"/>
+                <w:right w:val="none" w:sz="0" w:space="0" w:color="000000"/>
+              </w:pBdr>
+              <w:spacing w:after="100" w:before="100" w:line="240"/>
+              <w:ind w:left="100" w:right="100" w:firstLine="0" w:firstLineChars="0"/>
+              <w:rPr>
+                <w:rFonts w:ascii="Helvetica" w:hAnsi="Helvetica" w:eastAsia="Helvetica" w:cs="Helvetica"/>
+                <w:i w:val="false"/>
+                <w:b w:val="false"/>
+                <w:u w:val="none"/>
+                <w:sz w:val="20"/>
+                <w:szCs w:val="20"/>
+                <w:color w:val="000000"/>
+              </w:rPr>
+            </w:pPr>
+            <w:r>
+              <w:rPr>
+                <w:rFonts w:ascii="Helvetica" w:hAnsi="Helvetica" w:eastAsia="Helvetica" w:cs="Helvetica"/>
+                <w:i w:val="false"/>
+                <w:b w:val="false"/>
+                <w:u w:val="none"/>
+                <w:sz w:val="20"/>
+                <w:szCs w:val="20"/>
+                <w:color w:val="000000"/>
+              </w:rPr>
+              <w:t xml:space="preserve">3 ± 1.4</w:t>
+            </w:r>
+          </w:p>
+        </w:tc>
+        <w:tc>
+          <w:tcPr>
+            <w:tcBorders>
+              <w:bottom w:val="none" w:sz="0" w:space="0" w:color="000000"/>
+              <w:top w:val="none" w:sz="0" w:space="0" w:color="000000"/>
+              <w:left w:val="none" w:sz="0" w:space="0" w:color="000000"/>
+              <w:right w:val="none" w:sz="0" w:space="0" w:color="000000"/>
+            </w:tcBorders>
+            <w:shd w:val="clear" w:color="auto" w:fill="FFFFFF"/>
+            <w:tcMar>
+              <w:top w:w="0" w:type="dxa"/>
+              <w:bottom w:w="0" w:type="dxa"/>
+              <w:left w:w="0" w:type="dxa"/>
+              <w:right w:w="0" w:type="dxa"/>
+            </w:tcMar>
+            <w:vAlign w:val="center"/>
+          </w:tcPr>
+          <w:p>
+            <w:pPr>
+              <w:jc w:val="center"/>
+              <w:pBdr>
+                <w:bottom w:val="none" w:sz="0" w:space="0" w:color="000000"/>
+                <w:top w:val="none" w:sz="0" w:space="0" w:color="000000"/>
+                <w:left w:val="none" w:sz="0" w:space="0" w:color="000000"/>
+                <w:right w:val="none" w:sz="0" w:space="0" w:color="000000"/>
+              </w:pBdr>
+              <w:spacing w:after="100" w:before="100" w:line="240"/>
+              <w:ind w:left="100" w:right="100" w:firstLine="0" w:firstLineChars="0"/>
+              <w:rPr>
+                <w:rFonts w:ascii="Helvetica" w:hAnsi="Helvetica" w:eastAsia="Helvetica" w:cs="Helvetica"/>
+                <w:i w:val="false"/>
+                <w:b w:val="false"/>
+                <w:u w:val="none"/>
+                <w:sz w:val="20"/>
+                <w:szCs w:val="20"/>
+                <w:color w:val="000000"/>
+              </w:rPr>
+            </w:pPr>
+            <w:r>
+              <w:rPr>
+                <w:rFonts w:ascii="Helvetica" w:hAnsi="Helvetica" w:eastAsia="Helvetica" w:cs="Helvetica"/>
+                <w:i w:val="false"/>
+                <w:b w:val="false"/>
+                <w:u w:val="none"/>
+                <w:sz w:val="20"/>
+                <w:szCs w:val="20"/>
+                <w:color w:val="000000"/>
+              </w:rPr>
+              <w:t xml:space="preserve">3 [2–4]</w:t>
+            </w:r>
+          </w:p>
+        </w:tc>
+      </w:tr>
+      <w:tr>
+        <w:trPr>
+          <w:trHeight w:val="360" w:hRule="auto"/>
+        </w:trPr>
+        body17
+        <w:tc>
+          <w:tcPr>
+            <w:tcBorders>
+              <w:bottom w:val="none" w:sz="0" w:space="0" w:color="000000"/>
+              <w:top w:val="none" w:sz="0" w:space="0" w:color="000000"/>
+              <w:left w:val="none" w:sz="0" w:space="0" w:color="000000"/>
+              <w:right w:val="none" w:sz="0" w:space="0" w:color="000000"/>
+            </w:tcBorders>
+            <w:shd w:val="clear" w:color="auto" w:fill="FFFFFF"/>
+            <w:tcMar>
+              <w:top w:w="0" w:type="dxa"/>
+              <w:bottom w:w="0" w:type="dxa"/>
+              <w:left w:w="0" w:type="dxa"/>
+              <w:right w:w="0" w:type="dxa"/>
+            </w:tcMar>
+            <w:vAlign w:val="center"/>
+          </w:tcPr>
+          <w:p>
+            <w:pPr>
+              <w:jc w:val="left"/>
+              <w:pBdr>
+                <w:bottom w:val="none" w:sz="0" w:space="0" w:color="000000"/>
+                <w:top w:val="none" w:sz="0" w:space="0" w:color="000000"/>
+                <w:left w:val="none" w:sz="0" w:space="0" w:color="000000"/>
+                <w:right w:val="none" w:sz="0" w:space="0" w:color="000000"/>
+              </w:pBdr>
+              <w:spacing w:after="100" w:before="100" w:line="240"/>
+              <w:ind w:left="100" w:right="100" w:firstLine="0" w:firstLineChars="0"/>
+              <w:rPr>
+                <w:rFonts w:ascii="Helvetica" w:hAnsi="Helvetica" w:eastAsia="Helvetica" w:cs="Helvetica"/>
+                <w:i w:val="false"/>
+                <w:b w:val="false"/>
+                <w:u w:val="none"/>
+                <w:sz w:val="20"/>
+                <w:szCs w:val="20"/>
+                <w:color w:val="000000"/>
+              </w:rPr>
+            </w:pPr>
+            <w:r>
+              <w:rPr>
+                <w:rFonts w:ascii="Helvetica" w:hAnsi="Helvetica" w:eastAsia="Helvetica" w:cs="Helvetica"/>
+                <w:i w:val="false"/>
+                <w:b w:val="false"/>
+                <w:u w:val="none"/>
+                <w:sz w:val="20"/>
+                <w:szCs w:val="20"/>
+                <w:color w:val="000000"/>
+              </w:rPr>
+              <w:t xml:space="preserve">AIS_spine</w:t>
+            </w:r>
+          </w:p>
+        </w:tc>
+        <w:tc>
+          <w:tcPr>
+            <w:tcBorders>
+              <w:bottom w:val="none" w:sz="0" w:space="0" w:color="000000"/>
+              <w:top w:val="none" w:sz="0" w:space="0" w:color="000000"/>
+              <w:left w:val="none" w:sz="0" w:space="0" w:color="000000"/>
+              <w:right w:val="none" w:sz="0" w:space="0" w:color="000000"/>
+            </w:tcBorders>
+            <w:shd w:val="clear" w:color="auto" w:fill="FFFFFF"/>
+            <w:tcMar>
+              <w:top w:w="0" w:type="dxa"/>
+              <w:bottom w:w="0" w:type="dxa"/>
+              <w:left w:w="0" w:type="dxa"/>
+              <w:right w:w="0" w:type="dxa"/>
+            </w:tcMar>
+            <w:vAlign w:val="center"/>
+          </w:tcPr>
+          <w:p>
+            <w:pPr>
+              <w:jc w:val="center"/>
+              <w:pBdr>
+                <w:bottom w:val="none" w:sz="0" w:space="0" w:color="000000"/>
+                <w:top w:val="none" w:sz="0" w:space="0" w:color="000000"/>
+                <w:left w:val="none" w:sz="0" w:space="0" w:color="000000"/>
+                <w:right w:val="none" w:sz="0" w:space="0" w:color="000000"/>
+              </w:pBdr>
+              <w:spacing w:after="100" w:before="100" w:line="240"/>
+              <w:ind w:left="100" w:right="100" w:firstLine="0" w:firstLineChars="0"/>
+              <w:rPr>
+                <w:rFonts w:ascii="Helvetica" w:hAnsi="Helvetica" w:eastAsia="Helvetica" w:cs="Helvetica"/>
+                <w:i w:val="false"/>
+                <w:b w:val="false"/>
+                <w:u w:val="none"/>
+                <w:sz w:val="20"/>
+                <w:szCs w:val="20"/>
+                <w:color w:val="000000"/>
+              </w:rPr>
+            </w:pPr>
+            <w:r>
+              <w:rPr>
+                <w:rFonts w:ascii="Helvetica" w:hAnsi="Helvetica" w:eastAsia="Helvetica" w:cs="Helvetica"/>
+                <w:i w:val="false"/>
+                <w:b w:val="false"/>
+                <w:u w:val="none"/>
+                <w:sz w:val="20"/>
+                <w:szCs w:val="20"/>
+                <w:color w:val="000000"/>
+              </w:rPr>
+              <w:t xml:space="preserve"/>
+            </w:r>
+          </w:p>
+        </w:tc>
+        <w:tc>
+          <w:tcPr>
+            <w:tcBorders>
+              <w:bottom w:val="none" w:sz="0" w:space="0" w:color="000000"/>
+              <w:top w:val="none" w:sz="0" w:space="0" w:color="000000"/>
+              <w:left w:val="none" w:sz="0" w:space="0" w:color="000000"/>
+              <w:right w:val="none" w:sz="0" w:space="0" w:color="000000"/>
+            </w:tcBorders>
+            <w:shd w:val="clear" w:color="auto" w:fill="FFFFFF"/>
+            <w:tcMar>
+              <w:top w:w="0" w:type="dxa"/>
+              <w:bottom w:w="0" w:type="dxa"/>
+              <w:left w:w="0" w:type="dxa"/>
+              <w:right w:w="0" w:type="dxa"/>
+            </w:tcMar>
+            <w:vAlign w:val="center"/>
+          </w:tcPr>
+          <w:p>
+            <w:pPr>
+              <w:jc w:val="center"/>
+              <w:pBdr>
+                <w:bottom w:val="none" w:sz="0" w:space="0" w:color="000000"/>
+                <w:top w:val="none" w:sz="0" w:space="0" w:color="000000"/>
+                <w:left w:val="none" w:sz="0" w:space="0" w:color="000000"/>
+                <w:right w:val="none" w:sz="0" w:space="0" w:color="000000"/>
+              </w:pBdr>
+              <w:spacing w:after="100" w:before="100" w:line="240"/>
+              <w:ind w:left="100" w:right="100" w:firstLine="0" w:firstLineChars="0"/>
+              <w:rPr>
+                <w:rFonts w:ascii="Helvetica" w:hAnsi="Helvetica" w:eastAsia="Helvetica" w:cs="Helvetica"/>
+                <w:i w:val="false"/>
+                <w:b w:val="false"/>
+                <w:u w:val="none"/>
+                <w:sz w:val="20"/>
+                <w:szCs w:val="20"/>
+                <w:color w:val="000000"/>
+              </w:rPr>
+            </w:pPr>
+            <w:r>
+              <w:rPr>
+                <w:rFonts w:ascii="Helvetica" w:hAnsi="Helvetica" w:eastAsia="Helvetica" w:cs="Helvetica"/>
+                <w:i w:val="false"/>
+                <w:b w:val="false"/>
+                <w:u w:val="none"/>
+                <w:sz w:val="20"/>
+                <w:szCs w:val="20"/>
+                <w:color w:val="000000"/>
+              </w:rPr>
+              <w:t xml:space="preserve">2.5 ± 1</w:t>
+            </w:r>
+          </w:p>
+        </w:tc>
+        <w:tc>
+          <w:tcPr>
+            <w:tcBorders>
+              <w:bottom w:val="none" w:sz="0" w:space="0" w:color="000000"/>
+              <w:top w:val="none" w:sz="0" w:space="0" w:color="000000"/>
+              <w:left w:val="none" w:sz="0" w:space="0" w:color="000000"/>
+              <w:right w:val="none" w:sz="0" w:space="0" w:color="000000"/>
+            </w:tcBorders>
+            <w:shd w:val="clear" w:color="auto" w:fill="FFFFFF"/>
+            <w:tcMar>
+              <w:top w:w="0" w:type="dxa"/>
+              <w:bottom w:w="0" w:type="dxa"/>
+              <w:left w:w="0" w:type="dxa"/>
+              <w:right w:w="0" w:type="dxa"/>
+            </w:tcMar>
+            <w:vAlign w:val="center"/>
+          </w:tcPr>
+          <w:p>
+            <w:pPr>
+              <w:jc w:val="center"/>
+              <w:pBdr>
+                <w:bottom w:val="none" w:sz="0" w:space="0" w:color="000000"/>
+                <w:top w:val="none" w:sz="0" w:space="0" w:color="000000"/>
+                <w:left w:val="none" w:sz="0" w:space="0" w:color="000000"/>
+                <w:right w:val="none" w:sz="0" w:space="0" w:color="000000"/>
+              </w:pBdr>
+              <w:spacing w:after="100" w:before="100" w:line="240"/>
+              <w:ind w:left="100" w:right="100" w:firstLine="0" w:firstLineChars="0"/>
+              <w:rPr>
+                <w:rFonts w:ascii="Helvetica" w:hAnsi="Helvetica" w:eastAsia="Helvetica" w:cs="Helvetica"/>
+                <w:i w:val="false"/>
+                <w:b w:val="false"/>
+                <w:u w:val="none"/>
+                <w:sz w:val="20"/>
+                <w:szCs w:val="20"/>
+                <w:color w:val="000000"/>
+              </w:rPr>
+            </w:pPr>
+            <w:r>
+              <w:rPr>
+                <w:rFonts w:ascii="Helvetica" w:hAnsi="Helvetica" w:eastAsia="Helvetica" w:cs="Helvetica"/>
+                <w:i w:val="false"/>
+                <w:b w:val="false"/>
+                <w:u w:val="none"/>
+                <w:sz w:val="20"/>
+                <w:szCs w:val="20"/>
+                <w:color w:val="000000"/>
+              </w:rPr>
+              <w:t xml:space="preserve">2 [2–2]</w:t>
+            </w:r>
+          </w:p>
+        </w:tc>
+      </w:tr>
+      <w:tr>
+        <w:trPr>
+          <w:trHeight w:val="360" w:hRule="auto"/>
+        </w:trPr>
+        body18
+        <w:tc>
+          <w:tcPr>
+            <w:tcBorders>
+              <w:bottom w:val="none" w:sz="0" w:space="0" w:color="000000"/>
+              <w:top w:val="none" w:sz="0" w:space="0" w:color="000000"/>
+              <w:left w:val="none" w:sz="0" w:space="0" w:color="000000"/>
+              <w:right w:val="none" w:sz="0" w:space="0" w:color="000000"/>
+            </w:tcBorders>
+            <w:shd w:val="clear" w:color="auto" w:fill="FFFFFF"/>
+            <w:tcMar>
+              <w:top w:w="0" w:type="dxa"/>
+              <w:bottom w:w="0" w:type="dxa"/>
+              <w:left w:w="0" w:type="dxa"/>
+              <w:right w:w="0" w:type="dxa"/>
+            </w:tcMar>
+            <w:vAlign w:val="center"/>
+          </w:tcPr>
+          <w:p>
+            <w:pPr>
+              <w:jc w:val="left"/>
+              <w:pBdr>
+                <w:bottom w:val="none" w:sz="0" w:space="0" w:color="000000"/>
+                <w:top w:val="none" w:sz="0" w:space="0" w:color="000000"/>
+                <w:left w:val="none" w:sz="0" w:space="0" w:color="000000"/>
+                <w:right w:val="none" w:sz="0" w:space="0" w:color="000000"/>
+              </w:pBdr>
+              <w:spacing w:after="100" w:before="100" w:line="240"/>
+              <w:ind w:left="100" w:right="100" w:firstLine="0" w:firstLineChars="0"/>
+              <w:rPr>
+                <w:rFonts w:ascii="Helvetica" w:hAnsi="Helvetica" w:eastAsia="Helvetica" w:cs="Helvetica"/>
+                <w:i w:val="false"/>
+                <w:b w:val="false"/>
+                <w:u w:val="none"/>
+                <w:sz w:val="20"/>
+                <w:szCs w:val="20"/>
+                <w:color w:val="000000"/>
+              </w:rPr>
+            </w:pPr>
+            <w:r>
+              <w:rPr>
+                <w:rFonts w:ascii="Helvetica" w:hAnsi="Helvetica" w:eastAsia="Helvetica" w:cs="Helvetica"/>
+                <w:i w:val="false"/>
+                <w:b w:val="false"/>
+                <w:u w:val="none"/>
+                <w:sz w:val="20"/>
+                <w:szCs w:val="20"/>
+                <w:color w:val="000000"/>
+              </w:rPr>
+              <w:t xml:space="preserve">time_to_ppx</w:t>
+            </w:r>
+          </w:p>
+        </w:tc>
+        <w:tc>
+          <w:tcPr>
+            <w:tcBorders>
+              <w:bottom w:val="none" w:sz="0" w:space="0" w:color="000000"/>
+              <w:top w:val="none" w:sz="0" w:space="0" w:color="000000"/>
+              <w:left w:val="none" w:sz="0" w:space="0" w:color="000000"/>
+              <w:right w:val="none" w:sz="0" w:space="0" w:color="000000"/>
+            </w:tcBorders>
+            <w:shd w:val="clear" w:color="auto" w:fill="FFFFFF"/>
+            <w:tcMar>
+              <w:top w:w="0" w:type="dxa"/>
+              <w:bottom w:w="0" w:type="dxa"/>
+              <w:left w:w="0" w:type="dxa"/>
+              <w:right w:w="0" w:type="dxa"/>
+            </w:tcMar>
+            <w:vAlign w:val="center"/>
+          </w:tcPr>
+          <w:p>
+            <w:pPr>
+              <w:jc w:val="center"/>
+              <w:pBdr>
+                <w:bottom w:val="none" w:sz="0" w:space="0" w:color="000000"/>
+                <w:top w:val="none" w:sz="0" w:space="0" w:color="000000"/>
+                <w:left w:val="none" w:sz="0" w:space="0" w:color="000000"/>
+                <w:right w:val="none" w:sz="0" w:space="0" w:color="000000"/>
+              </w:pBdr>
+              <w:spacing w:after="100" w:before="100" w:line="240"/>
+              <w:ind w:left="100" w:right="100" w:firstLine="0" w:firstLineChars="0"/>
+              <w:rPr>
+                <w:rFonts w:ascii="Helvetica" w:hAnsi="Helvetica" w:eastAsia="Helvetica" w:cs="Helvetica"/>
+                <w:i w:val="false"/>
+                <w:b w:val="false"/>
+                <w:u w:val="none"/>
+                <w:sz w:val="20"/>
+                <w:szCs w:val="20"/>
+                <w:color w:val="000000"/>
+              </w:rPr>
+            </w:pPr>
+            <w:r>
+              <w:rPr>
+                <w:rFonts w:ascii="Helvetica" w:hAnsi="Helvetica" w:eastAsia="Helvetica" w:cs="Helvetica"/>
+                <w:i w:val="false"/>
+                <w:b w:val="false"/>
+                <w:u w:val="none"/>
+                <w:sz w:val="20"/>
+                <w:szCs w:val="20"/>
+                <w:color w:val="000000"/>
+              </w:rPr>
+              <w:t xml:space="preserve"/>
+            </w:r>
+          </w:p>
+        </w:tc>
+        <w:tc>
+          <w:tcPr>
+            <w:tcBorders>
+              <w:bottom w:val="none" w:sz="0" w:space="0" w:color="000000"/>
+              <w:top w:val="none" w:sz="0" w:space="0" w:color="000000"/>
+              <w:left w:val="none" w:sz="0" w:space="0" w:color="000000"/>
+              <w:right w:val="none" w:sz="0" w:space="0" w:color="000000"/>
+            </w:tcBorders>
+            <w:shd w:val="clear" w:color="auto" w:fill="FFFFFF"/>
+            <w:tcMar>
+              <w:top w:w="0" w:type="dxa"/>
+              <w:bottom w:w="0" w:type="dxa"/>
+              <w:left w:w="0" w:type="dxa"/>
+              <w:right w:w="0" w:type="dxa"/>
+            </w:tcMar>
+            <w:vAlign w:val="center"/>
+          </w:tcPr>
+          <w:p>
+            <w:pPr>
+              <w:jc w:val="center"/>
+              <w:pBdr>
+                <w:bottom w:val="none" w:sz="0" w:space="0" w:color="000000"/>
+                <w:top w:val="none" w:sz="0" w:space="0" w:color="000000"/>
+                <w:left w:val="none" w:sz="0" w:space="0" w:color="000000"/>
+                <w:right w:val="none" w:sz="0" w:space="0" w:color="000000"/>
+              </w:pBdr>
+              <w:spacing w:after="100" w:before="100" w:line="240"/>
+              <w:ind w:left="100" w:right="100" w:firstLine="0" w:firstLineChars="0"/>
+              <w:rPr>
+                <w:rFonts w:ascii="Helvetica" w:hAnsi="Helvetica" w:eastAsia="Helvetica" w:cs="Helvetica"/>
+                <w:i w:val="false"/>
+                <w:b w:val="false"/>
+                <w:u w:val="none"/>
+                <w:sz w:val="20"/>
+                <w:szCs w:val="20"/>
+                <w:color w:val="000000"/>
+              </w:rPr>
+            </w:pPr>
+            <w:r>
+              <w:rPr>
+                <w:rFonts w:ascii="Helvetica" w:hAnsi="Helvetica" w:eastAsia="Helvetica" w:cs="Helvetica"/>
+                <w:i w:val="false"/>
+                <w:b w:val="false"/>
+                <w:u w:val="none"/>
+                <w:sz w:val="20"/>
+                <w:szCs w:val="20"/>
+                <w:color w:val="000000"/>
+              </w:rPr>
+              <w:t xml:space="preserve">59.2 ± 36.9</w:t>
+            </w:r>
+          </w:p>
+        </w:tc>
+        <w:tc>
+          <w:tcPr>
+            <w:tcBorders>
+              <w:bottom w:val="none" w:sz="0" w:space="0" w:color="000000"/>
+              <w:top w:val="none" w:sz="0" w:space="0" w:color="000000"/>
+              <w:left w:val="none" w:sz="0" w:space="0" w:color="000000"/>
+              <w:right w:val="none" w:sz="0" w:space="0" w:color="000000"/>
+            </w:tcBorders>
+            <w:shd w:val="clear" w:color="auto" w:fill="FFFFFF"/>
+            <w:tcMar>
+              <w:top w:w="0" w:type="dxa"/>
+              <w:bottom w:w="0" w:type="dxa"/>
+              <w:left w:w="0" w:type="dxa"/>
+              <w:right w:w="0" w:type="dxa"/>
+            </w:tcMar>
+            <w:vAlign w:val="center"/>
+          </w:tcPr>
+          <w:p>
+            <w:pPr>
+              <w:jc w:val="center"/>
+              <w:pBdr>
+                <w:bottom w:val="none" w:sz="0" w:space="0" w:color="000000"/>
+                <w:top w:val="none" w:sz="0" w:space="0" w:color="000000"/>
+                <w:left w:val="none" w:sz="0" w:space="0" w:color="000000"/>
+                <w:right w:val="none" w:sz="0" w:space="0" w:color="000000"/>
+              </w:pBdr>
+              <w:spacing w:after="100" w:before="100" w:line="240"/>
+              <w:ind w:left="100" w:right="100" w:firstLine="0" w:firstLineChars="0"/>
+              <w:rPr>
+                <w:rFonts w:ascii="Helvetica" w:hAnsi="Helvetica" w:eastAsia="Helvetica" w:cs="Helvetica"/>
+                <w:i w:val="false"/>
+                <w:b w:val="false"/>
+                <w:u w:val="none"/>
+                <w:sz w:val="20"/>
+                <w:szCs w:val="20"/>
+                <w:color w:val="000000"/>
+              </w:rPr>
+            </w:pPr>
+            <w:r>
+              <w:rPr>
+                <w:rFonts w:ascii="Helvetica" w:hAnsi="Helvetica" w:eastAsia="Helvetica" w:cs="Helvetica"/>
+                <w:i w:val="false"/>
+                <w:b w:val="false"/>
+                <w:u w:val="none"/>
+                <w:sz w:val="20"/>
+                <w:szCs w:val="20"/>
+                <w:color w:val="000000"/>
+              </w:rPr>
+              <w:t xml:space="preserve">57.9 [33.5–81]</w:t>
+            </w:r>
+          </w:p>
+        </w:tc>
+      </w:tr>
+      <w:tr>
+        <w:trPr>
+          <w:trHeight w:val="360" w:hRule="auto"/>
+        </w:trPr>
+        body19
+        <w:tc>
+          <w:tcPr>
+            <w:tcBorders>
+              <w:bottom w:val="none" w:sz="0" w:space="0" w:color="000000"/>
+              <w:top w:val="none" w:sz="0" w:space="0" w:color="000000"/>
+              <w:left w:val="none" w:sz="0" w:space="0" w:color="000000"/>
+              <w:right w:val="none" w:sz="0" w:space="0" w:color="000000"/>
+            </w:tcBorders>
+            <w:shd w:val="clear" w:color="auto" w:fill="FFFFFF"/>
+            <w:tcMar>
+              <w:top w:w="0" w:type="dxa"/>
+              <w:bottom w:w="0" w:type="dxa"/>
+              <w:left w:w="0" w:type="dxa"/>
+              <w:right w:w="0" w:type="dxa"/>
+            </w:tcMar>
+            <w:vAlign w:val="center"/>
+          </w:tcPr>
+          <w:p>
+            <w:pPr>
+              <w:jc w:val="left"/>
+              <w:pBdr>
+                <w:bottom w:val="none" w:sz="0" w:space="0" w:color="000000"/>
+                <w:top w:val="none" w:sz="0" w:space="0" w:color="000000"/>
+                <w:left w:val="none" w:sz="0" w:space="0" w:color="000000"/>
+                <w:right w:val="none" w:sz="0" w:space="0" w:color="000000"/>
+              </w:pBdr>
+              <w:spacing w:after="100" w:before="100" w:line="240"/>
+              <w:ind w:left="100" w:right="100" w:firstLine="0" w:firstLineChars="0"/>
+              <w:rPr>
+                <w:rFonts w:ascii="Helvetica" w:hAnsi="Helvetica" w:eastAsia="Helvetica" w:cs="Helvetica"/>
+                <w:i w:val="false"/>
+                <w:b w:val="false"/>
+                <w:u w:val="none"/>
+                <w:sz w:val="20"/>
+                <w:szCs w:val="20"/>
+                <w:color w:val="000000"/>
+              </w:rPr>
+            </w:pPr>
+            <w:r>
+              <w:rPr>
+                <w:rFonts w:ascii="Helvetica" w:hAnsi="Helvetica" w:eastAsia="Helvetica" w:cs="Helvetica"/>
+                <w:i w:val="false"/>
+                <w:b w:val="false"/>
+                <w:u w:val="none"/>
+                <w:sz w:val="20"/>
+                <w:szCs w:val="20"/>
+                <w:color w:val="000000"/>
+              </w:rPr>
+              <w:t xml:space="preserve">hospital_days</w:t>
+            </w:r>
+          </w:p>
+        </w:tc>
+        <w:tc>
+          <w:tcPr>
+            <w:tcBorders>
+              <w:bottom w:val="none" w:sz="0" w:space="0" w:color="000000"/>
+              <w:top w:val="none" w:sz="0" w:space="0" w:color="000000"/>
+              <w:left w:val="none" w:sz="0" w:space="0" w:color="000000"/>
+              <w:right w:val="none" w:sz="0" w:space="0" w:color="000000"/>
+            </w:tcBorders>
+            <w:shd w:val="clear" w:color="auto" w:fill="FFFFFF"/>
+            <w:tcMar>
+              <w:top w:w="0" w:type="dxa"/>
+              <w:bottom w:w="0" w:type="dxa"/>
+              <w:left w:w="0" w:type="dxa"/>
+              <w:right w:w="0" w:type="dxa"/>
+            </w:tcMar>
+            <w:vAlign w:val="center"/>
+          </w:tcPr>
+          <w:p>
+            <w:pPr>
+              <w:jc w:val="center"/>
+              <w:pBdr>
+                <w:bottom w:val="none" w:sz="0" w:space="0" w:color="000000"/>
+                <w:top w:val="none" w:sz="0" w:space="0" w:color="000000"/>
+                <w:left w:val="none" w:sz="0" w:space="0" w:color="000000"/>
+                <w:right w:val="none" w:sz="0" w:space="0" w:color="000000"/>
+              </w:pBdr>
+              <w:spacing w:after="100" w:before="100" w:line="240"/>
+              <w:ind w:left="100" w:right="100" w:firstLine="0" w:firstLineChars="0"/>
+              <w:rPr>
+                <w:rFonts w:ascii="Helvetica" w:hAnsi="Helvetica" w:eastAsia="Helvetica" w:cs="Helvetica"/>
+                <w:i w:val="false"/>
+                <w:b w:val="false"/>
+                <w:u w:val="none"/>
+                <w:sz w:val="20"/>
+                <w:szCs w:val="20"/>
+                <w:color w:val="000000"/>
+              </w:rPr>
+            </w:pPr>
+            <w:r>
+              <w:rPr>
+                <w:rFonts w:ascii="Helvetica" w:hAnsi="Helvetica" w:eastAsia="Helvetica" w:cs="Helvetica"/>
+                <w:i w:val="false"/>
+                <w:b w:val="false"/>
+                <w:u w:val="none"/>
+                <w:sz w:val="20"/>
+                <w:szCs w:val="20"/>
+                <w:color w:val="000000"/>
+              </w:rPr>
+              <w:t xml:space="preserve"/>
+            </w:r>
+          </w:p>
+        </w:tc>
+        <w:tc>
+          <w:tcPr>
+            <w:tcBorders>
+              <w:bottom w:val="none" w:sz="0" w:space="0" w:color="000000"/>
+              <w:top w:val="none" w:sz="0" w:space="0" w:color="000000"/>
+              <w:left w:val="none" w:sz="0" w:space="0" w:color="000000"/>
+              <w:right w:val="none" w:sz="0" w:space="0" w:color="000000"/>
+            </w:tcBorders>
+            <w:shd w:val="clear" w:color="auto" w:fill="FFFFFF"/>
+            <w:tcMar>
+              <w:top w:w="0" w:type="dxa"/>
+              <w:bottom w:w="0" w:type="dxa"/>
+              <w:left w:w="0" w:type="dxa"/>
+              <w:right w:w="0" w:type="dxa"/>
+            </w:tcMar>
+            <w:vAlign w:val="center"/>
+          </w:tcPr>
+          <w:p>
+            <w:pPr>
+              <w:jc w:val="center"/>
+              <w:pBdr>
+                <w:bottom w:val="none" w:sz="0" w:space="0" w:color="000000"/>
+                <w:top w:val="none" w:sz="0" w:space="0" w:color="000000"/>
+                <w:left w:val="none" w:sz="0" w:space="0" w:color="000000"/>
+                <w:right w:val="none" w:sz="0" w:space="0" w:color="000000"/>
+              </w:pBdr>
+              <w:spacing w:after="100" w:before="100" w:line="240"/>
+              <w:ind w:left="100" w:right="100" w:firstLine="0" w:firstLineChars="0"/>
+              <w:rPr>
+                <w:rFonts w:ascii="Helvetica" w:hAnsi="Helvetica" w:eastAsia="Helvetica" w:cs="Helvetica"/>
+                <w:i w:val="false"/>
+                <w:b w:val="false"/>
+                <w:u w:val="none"/>
+                <w:sz w:val="20"/>
+                <w:szCs w:val="20"/>
+                <w:color w:val="000000"/>
+              </w:rPr>
+            </w:pPr>
+            <w:r>
+              <w:rPr>
+                <w:rFonts w:ascii="Helvetica" w:hAnsi="Helvetica" w:eastAsia="Helvetica" w:cs="Helvetica"/>
+                <w:i w:val="false"/>
+                <w:b w:val="false"/>
+                <w:u w:val="none"/>
+                <w:sz w:val="20"/>
+                <w:szCs w:val="20"/>
+                <w:color w:val="000000"/>
+              </w:rPr>
+              <w:t xml:space="preserve">30.4 ± 34.7</w:t>
+            </w:r>
+          </w:p>
+        </w:tc>
+        <w:tc>
+          <w:tcPr>
+            <w:tcBorders>
+              <w:bottom w:val="none" w:sz="0" w:space="0" w:color="000000"/>
+              <w:top w:val="none" w:sz="0" w:space="0" w:color="000000"/>
+              <w:left w:val="none" w:sz="0" w:space="0" w:color="000000"/>
+              <w:right w:val="none" w:sz="0" w:space="0" w:color="000000"/>
+            </w:tcBorders>
+            <w:shd w:val="clear" w:color="auto" w:fill="FFFFFF"/>
+            <w:tcMar>
+              <w:top w:w="0" w:type="dxa"/>
+              <w:bottom w:w="0" w:type="dxa"/>
+              <w:left w:w="0" w:type="dxa"/>
+              <w:right w:w="0" w:type="dxa"/>
+            </w:tcMar>
+            <w:vAlign w:val="center"/>
+          </w:tcPr>
+          <w:p>
+            <w:pPr>
+              <w:jc w:val="center"/>
+              <w:pBdr>
+                <w:bottom w:val="none" w:sz="0" w:space="0" w:color="000000"/>
+                <w:top w:val="none" w:sz="0" w:space="0" w:color="000000"/>
+                <w:left w:val="none" w:sz="0" w:space="0" w:color="000000"/>
+                <w:right w:val="none" w:sz="0" w:space="0" w:color="000000"/>
+              </w:pBdr>
+              <w:spacing w:after="100" w:before="100" w:line="240"/>
+              <w:ind w:left="100" w:right="100" w:firstLine="0" w:firstLineChars="0"/>
+              <w:rPr>
+                <w:rFonts w:ascii="Helvetica" w:hAnsi="Helvetica" w:eastAsia="Helvetica" w:cs="Helvetica"/>
+                <w:i w:val="false"/>
+                <w:b w:val="false"/>
+                <w:u w:val="none"/>
+                <w:sz w:val="20"/>
+                <w:szCs w:val="20"/>
+                <w:color w:val="000000"/>
+              </w:rPr>
+            </w:pPr>
+            <w:r>
+              <w:rPr>
+                <w:rFonts w:ascii="Helvetica" w:hAnsi="Helvetica" w:eastAsia="Helvetica" w:cs="Helvetica"/>
+                <w:i w:val="false"/>
+                <w:b w:val="false"/>
+                <w:u w:val="none"/>
+                <w:sz w:val="20"/>
+                <w:szCs w:val="20"/>
+                <w:color w:val="000000"/>
+              </w:rPr>
+              <w:t xml:space="preserve">21 [13.2–36]</w:t>
+            </w:r>
+          </w:p>
+        </w:tc>
+      </w:tr>
+      <w:tr>
+        <w:trPr>
+          <w:trHeight w:val="360" w:hRule="auto"/>
+        </w:trPr>
+        body20
+        <w:tc>
+          <w:tcPr>
+            <w:tcBorders>
+              <w:bottom w:val="none" w:sz="0" w:space="0" w:color="000000"/>
+              <w:top w:val="none" w:sz="0" w:space="0" w:color="000000"/>
+              <w:left w:val="none" w:sz="0" w:space="0" w:color="000000"/>
+              <w:right w:val="none" w:sz="0" w:space="0" w:color="000000"/>
+            </w:tcBorders>
+            <w:shd w:val="clear" w:color="auto" w:fill="FFFFFF"/>
+            <w:tcMar>
+              <w:top w:w="0" w:type="dxa"/>
+              <w:bottom w:w="0" w:type="dxa"/>
+              <w:left w:w="0" w:type="dxa"/>
+              <w:right w:w="0" w:type="dxa"/>
+            </w:tcMar>
+            <w:vAlign w:val="center"/>
+          </w:tcPr>
+          <w:p>
+            <w:pPr>
+              <w:jc w:val="left"/>
+              <w:pBdr>
+                <w:bottom w:val="none" w:sz="0" w:space="0" w:color="000000"/>
+                <w:top w:val="none" w:sz="0" w:space="0" w:color="000000"/>
+                <w:left w:val="none" w:sz="0" w:space="0" w:color="000000"/>
+                <w:right w:val="none" w:sz="0" w:space="0" w:color="000000"/>
+              </w:pBdr>
+              <w:spacing w:after="100" w:before="100" w:line="240"/>
+              <w:ind w:left="100" w:right="100" w:firstLine="0" w:firstLineChars="0"/>
+              <w:rPr>
+                <w:rFonts w:ascii="Helvetica" w:hAnsi="Helvetica" w:eastAsia="Helvetica" w:cs="Helvetica"/>
+                <w:i w:val="false"/>
+                <w:b w:val="false"/>
+                <w:u w:val="none"/>
+                <w:sz w:val="20"/>
+                <w:szCs w:val="20"/>
+                <w:color w:val="000000"/>
+              </w:rPr>
+            </w:pPr>
+            <w:r>
+              <w:rPr>
+                <w:rFonts w:ascii="Helvetica" w:hAnsi="Helvetica" w:eastAsia="Helvetica" w:cs="Helvetica"/>
+                <w:i w:val="false"/>
+                <w:b w:val="false"/>
+                <w:u w:val="none"/>
+                <w:sz w:val="20"/>
+                <w:szCs w:val="20"/>
+                <w:color w:val="000000"/>
+              </w:rPr>
+              <w:t xml:space="preserve">ICU_days</w:t>
+            </w:r>
+          </w:p>
+        </w:tc>
+        <w:tc>
+          <w:tcPr>
+            <w:tcBorders>
+              <w:bottom w:val="none" w:sz="0" w:space="0" w:color="000000"/>
+              <w:top w:val="none" w:sz="0" w:space="0" w:color="000000"/>
+              <w:left w:val="none" w:sz="0" w:space="0" w:color="000000"/>
+              <w:right w:val="none" w:sz="0" w:space="0" w:color="000000"/>
+            </w:tcBorders>
+            <w:shd w:val="clear" w:color="auto" w:fill="FFFFFF"/>
+            <w:tcMar>
+              <w:top w:w="0" w:type="dxa"/>
+              <w:bottom w:w="0" w:type="dxa"/>
+              <w:left w:w="0" w:type="dxa"/>
+              <w:right w:w="0" w:type="dxa"/>
+            </w:tcMar>
+            <w:vAlign w:val="center"/>
+          </w:tcPr>
+          <w:p>
+            <w:pPr>
+              <w:jc w:val="center"/>
+              <w:pBdr>
+                <w:bottom w:val="none" w:sz="0" w:space="0" w:color="000000"/>
+                <w:top w:val="none" w:sz="0" w:space="0" w:color="000000"/>
+                <w:left w:val="none" w:sz="0" w:space="0" w:color="000000"/>
+                <w:right w:val="none" w:sz="0" w:space="0" w:color="000000"/>
+              </w:pBdr>
+              <w:spacing w:after="100" w:before="100" w:line="240"/>
+              <w:ind w:left="100" w:right="100" w:firstLine="0" w:firstLineChars="0"/>
+              <w:rPr>
+                <w:rFonts w:ascii="Helvetica" w:hAnsi="Helvetica" w:eastAsia="Helvetica" w:cs="Helvetica"/>
+                <w:i w:val="false"/>
+                <w:b w:val="false"/>
+                <w:u w:val="none"/>
+                <w:sz w:val="20"/>
+                <w:szCs w:val="20"/>
+                <w:color w:val="000000"/>
+              </w:rPr>
+            </w:pPr>
+            <w:r>
+              <w:rPr>
+                <w:rFonts w:ascii="Helvetica" w:hAnsi="Helvetica" w:eastAsia="Helvetica" w:cs="Helvetica"/>
+                <w:i w:val="false"/>
+                <w:b w:val="false"/>
+                <w:u w:val="none"/>
+                <w:sz w:val="20"/>
+                <w:szCs w:val="20"/>
+                <w:color w:val="000000"/>
+              </w:rPr>
+              <w:t xml:space="preserve"/>
+            </w:r>
+          </w:p>
+        </w:tc>
+        <w:tc>
+          <w:tcPr>
+            <w:tcBorders>
+              <w:bottom w:val="none" w:sz="0" w:space="0" w:color="000000"/>
+              <w:top w:val="none" w:sz="0" w:space="0" w:color="000000"/>
+              <w:left w:val="none" w:sz="0" w:space="0" w:color="000000"/>
+              <w:right w:val="none" w:sz="0" w:space="0" w:color="000000"/>
+            </w:tcBorders>
+            <w:shd w:val="clear" w:color="auto" w:fill="FFFFFF"/>
+            <w:tcMar>
+              <w:top w:w="0" w:type="dxa"/>
+              <w:bottom w:w="0" w:type="dxa"/>
+              <w:left w:w="0" w:type="dxa"/>
+              <w:right w:w="0" w:type="dxa"/>
+            </w:tcMar>
+            <w:vAlign w:val="center"/>
+          </w:tcPr>
+          <w:p>
+            <w:pPr>
+              <w:jc w:val="center"/>
+              <w:pBdr>
+                <w:bottom w:val="none" w:sz="0" w:space="0" w:color="000000"/>
+                <w:top w:val="none" w:sz="0" w:space="0" w:color="000000"/>
+                <w:left w:val="none" w:sz="0" w:space="0" w:color="000000"/>
+                <w:right w:val="none" w:sz="0" w:space="0" w:color="000000"/>
+              </w:pBdr>
+              <w:spacing w:after="100" w:before="100" w:line="240"/>
+              <w:ind w:left="100" w:right="100" w:firstLine="0" w:firstLineChars="0"/>
+              <w:rPr>
+                <w:rFonts w:ascii="Helvetica" w:hAnsi="Helvetica" w:eastAsia="Helvetica" w:cs="Helvetica"/>
+                <w:i w:val="false"/>
+                <w:b w:val="false"/>
+                <w:u w:val="none"/>
+                <w:sz w:val="20"/>
+                <w:szCs w:val="20"/>
+                <w:color w:val="000000"/>
+              </w:rPr>
+            </w:pPr>
+            <w:r>
+              <w:rPr>
+                <w:rFonts w:ascii="Helvetica" w:hAnsi="Helvetica" w:eastAsia="Helvetica" w:cs="Helvetica"/>
+                <w:i w:val="false"/>
+                <w:b w:val="false"/>
+                <w:u w:val="none"/>
+                <w:sz w:val="20"/>
+                <w:szCs w:val="20"/>
+                <w:color w:val="000000"/>
+              </w:rPr>
+              <w:t xml:space="preserve">15.8 ± 18.8</w:t>
+            </w:r>
+          </w:p>
+        </w:tc>
+        <w:tc>
+          <w:tcPr>
+            <w:tcBorders>
+              <w:bottom w:val="none" w:sz="0" w:space="0" w:color="000000"/>
+              <w:top w:val="none" w:sz="0" w:space="0" w:color="000000"/>
+              <w:left w:val="none" w:sz="0" w:space="0" w:color="000000"/>
+              <w:right w:val="none" w:sz="0" w:space="0" w:color="000000"/>
+            </w:tcBorders>
+            <w:shd w:val="clear" w:color="auto" w:fill="FFFFFF"/>
+            <w:tcMar>
+              <w:top w:w="0" w:type="dxa"/>
+              <w:bottom w:w="0" w:type="dxa"/>
+              <w:left w:w="0" w:type="dxa"/>
+              <w:right w:w="0" w:type="dxa"/>
+            </w:tcMar>
+            <w:vAlign w:val="center"/>
+          </w:tcPr>
+          <w:p>
+            <w:pPr>
+              <w:jc w:val="center"/>
+              <w:pBdr>
+                <w:bottom w:val="none" w:sz="0" w:space="0" w:color="000000"/>
+                <w:top w:val="none" w:sz="0" w:space="0" w:color="000000"/>
+                <w:left w:val="none" w:sz="0" w:space="0" w:color="000000"/>
+                <w:right w:val="none" w:sz="0" w:space="0" w:color="000000"/>
+              </w:pBdr>
+              <w:spacing w:after="100" w:before="100" w:line="240"/>
+              <w:ind w:left="100" w:right="100" w:firstLine="0" w:firstLineChars="0"/>
+              <w:rPr>
+                <w:rFonts w:ascii="Helvetica" w:hAnsi="Helvetica" w:eastAsia="Helvetica" w:cs="Helvetica"/>
+                <w:i w:val="false"/>
+                <w:b w:val="false"/>
+                <w:u w:val="none"/>
+                <w:sz w:val="20"/>
+                <w:szCs w:val="20"/>
+                <w:color w:val="000000"/>
+              </w:rPr>
+            </w:pPr>
+            <w:r>
+              <w:rPr>
+                <w:rFonts w:ascii="Helvetica" w:hAnsi="Helvetica" w:eastAsia="Helvetica" w:cs="Helvetica"/>
+                <w:i w:val="false"/>
+                <w:b w:val="false"/>
+                <w:u w:val="none"/>
+                <w:sz w:val="20"/>
+                <w:szCs w:val="20"/>
+                <w:color w:val="000000"/>
+              </w:rPr>
+              <w:t xml:space="preserve">7 [4–22]</w:t>
+            </w:r>
+          </w:p>
+        </w:tc>
+      </w:tr>
+      <w:tr>
+        <w:trPr>
+          <w:trHeight w:val="360" w:hRule="auto"/>
+        </w:trPr>
+        body21
+        <w:tc>
+          <w:tcPr>
+            <w:tcBorders>
+              <w:bottom w:val="none" w:sz="0" w:space="0" w:color="000000"/>
+              <w:top w:val="none" w:sz="0" w:space="0" w:color="000000"/>
+              <w:left w:val="none" w:sz="0" w:space="0" w:color="000000"/>
+              <w:right w:val="none" w:sz="0" w:space="0" w:color="000000"/>
+            </w:tcBorders>
+            <w:shd w:val="clear" w:color="auto" w:fill="FFFFFF"/>
+            <w:tcMar>
+              <w:top w:w="0" w:type="dxa"/>
+              <w:bottom w:w="0" w:type="dxa"/>
+              <w:left w:w="0" w:type="dxa"/>
+              <w:right w:w="0" w:type="dxa"/>
+            </w:tcMar>
+            <w:vAlign w:val="center"/>
+          </w:tcPr>
+          <w:p>
+            <w:pPr>
+              <w:jc w:val="left"/>
+              <w:pBdr>
+                <w:bottom w:val="none" w:sz="0" w:space="0" w:color="000000"/>
+                <w:top w:val="none" w:sz="0" w:space="0" w:color="000000"/>
+                <w:left w:val="none" w:sz="0" w:space="0" w:color="000000"/>
+                <w:right w:val="none" w:sz="0" w:space="0" w:color="000000"/>
+              </w:pBdr>
+              <w:spacing w:after="100" w:before="100" w:line="240"/>
+              <w:ind w:left="100" w:right="100" w:firstLine="0" w:firstLineChars="0"/>
+              <w:rPr>
+                <w:rFonts w:ascii="Helvetica" w:hAnsi="Helvetica" w:eastAsia="Helvetica" w:cs="Helvetica"/>
+                <w:i w:val="false"/>
+                <w:b w:val="false"/>
+                <w:u w:val="none"/>
+                <w:sz w:val="20"/>
+                <w:szCs w:val="20"/>
+                <w:color w:val="000000"/>
+              </w:rPr>
+            </w:pPr>
+            <w:r>
+              <w:rPr>
+                <w:rFonts w:ascii="Helvetica" w:hAnsi="Helvetica" w:eastAsia="Helvetica" w:cs="Helvetica"/>
+                <w:i w:val="false"/>
+                <w:b w:val="false"/>
+                <w:u w:val="none"/>
+                <w:sz w:val="20"/>
+                <w:szCs w:val="20"/>
+                <w:color w:val="000000"/>
+              </w:rPr>
+              <w:t xml:space="preserve">vent_days</w:t>
+            </w:r>
+          </w:p>
+        </w:tc>
+        <w:tc>
+          <w:tcPr>
+            <w:tcBorders>
+              <w:bottom w:val="none" w:sz="0" w:space="0" w:color="000000"/>
+              <w:top w:val="none" w:sz="0" w:space="0" w:color="000000"/>
+              <w:left w:val="none" w:sz="0" w:space="0" w:color="000000"/>
+              <w:right w:val="none" w:sz="0" w:space="0" w:color="000000"/>
+            </w:tcBorders>
+            <w:shd w:val="clear" w:color="auto" w:fill="FFFFFF"/>
+            <w:tcMar>
+              <w:top w:w="0" w:type="dxa"/>
+              <w:bottom w:w="0" w:type="dxa"/>
+              <w:left w:w="0" w:type="dxa"/>
+              <w:right w:w="0" w:type="dxa"/>
+            </w:tcMar>
+            <w:vAlign w:val="center"/>
+          </w:tcPr>
+          <w:p>
+            <w:pPr>
+              <w:jc w:val="center"/>
+              <w:pBdr>
+                <w:bottom w:val="none" w:sz="0" w:space="0" w:color="000000"/>
+                <w:top w:val="none" w:sz="0" w:space="0" w:color="000000"/>
+                <w:left w:val="none" w:sz="0" w:space="0" w:color="000000"/>
+                <w:right w:val="none" w:sz="0" w:space="0" w:color="000000"/>
+              </w:pBdr>
+              <w:spacing w:after="100" w:before="100" w:line="240"/>
+              <w:ind w:left="100" w:right="100" w:firstLine="0" w:firstLineChars="0"/>
+              <w:rPr>
+                <w:rFonts w:ascii="Helvetica" w:hAnsi="Helvetica" w:eastAsia="Helvetica" w:cs="Helvetica"/>
+                <w:i w:val="false"/>
+                <w:b w:val="false"/>
+                <w:u w:val="none"/>
+                <w:sz w:val="20"/>
+                <w:szCs w:val="20"/>
+                <w:color w:val="000000"/>
+              </w:rPr>
+            </w:pPr>
+            <w:r>
+              <w:rPr>
+                <w:rFonts w:ascii="Helvetica" w:hAnsi="Helvetica" w:eastAsia="Helvetica" w:cs="Helvetica"/>
+                <w:i w:val="false"/>
+                <w:b w:val="false"/>
+                <w:u w:val="none"/>
+                <w:sz w:val="20"/>
+                <w:szCs w:val="20"/>
+                <w:color w:val="000000"/>
+              </w:rPr>
+              <w:t xml:space="preserve"/>
+            </w:r>
+          </w:p>
+        </w:tc>
+        <w:tc>
+          <w:tcPr>
+            <w:tcBorders>
+              <w:bottom w:val="none" w:sz="0" w:space="0" w:color="000000"/>
+              <w:top w:val="none" w:sz="0" w:space="0" w:color="000000"/>
+              <w:left w:val="none" w:sz="0" w:space="0" w:color="000000"/>
+              <w:right w:val="none" w:sz="0" w:space="0" w:color="000000"/>
+            </w:tcBorders>
+            <w:shd w:val="clear" w:color="auto" w:fill="FFFFFF"/>
+            <w:tcMar>
+              <w:top w:w="0" w:type="dxa"/>
+              <w:bottom w:w="0" w:type="dxa"/>
+              <w:left w:w="0" w:type="dxa"/>
+              <w:right w:w="0" w:type="dxa"/>
+            </w:tcMar>
+            <w:vAlign w:val="center"/>
+          </w:tcPr>
+          <w:p>
+            <w:pPr>
+              <w:jc w:val="center"/>
+              <w:pBdr>
+                <w:bottom w:val="none" w:sz="0" w:space="0" w:color="000000"/>
+                <w:top w:val="none" w:sz="0" w:space="0" w:color="000000"/>
+                <w:left w:val="none" w:sz="0" w:space="0" w:color="000000"/>
+                <w:right w:val="none" w:sz="0" w:space="0" w:color="000000"/>
+              </w:pBdr>
+              <w:spacing w:after="100" w:before="100" w:line="240"/>
+              <w:ind w:left="100" w:right="100" w:firstLine="0" w:firstLineChars="0"/>
+              <w:rPr>
+                <w:rFonts w:ascii="Helvetica" w:hAnsi="Helvetica" w:eastAsia="Helvetica" w:cs="Helvetica"/>
+                <w:i w:val="false"/>
+                <w:b w:val="false"/>
+                <w:u w:val="none"/>
+                <w:sz w:val="20"/>
+                <w:szCs w:val="20"/>
+                <w:color w:val="000000"/>
+              </w:rPr>
+            </w:pPr>
+            <w:r>
+              <w:rPr>
+                <w:rFonts w:ascii="Helvetica" w:hAnsi="Helvetica" w:eastAsia="Helvetica" w:cs="Helvetica"/>
+                <w:i w:val="false"/>
+                <w:b w:val="false"/>
+                <w:u w:val="none"/>
+                <w:sz w:val="20"/>
+                <w:szCs w:val="20"/>
+                <w:color w:val="000000"/>
+              </w:rPr>
+              <w:t xml:space="preserve">9.4 ± 13.4</w:t>
+            </w:r>
+          </w:p>
+        </w:tc>
+        <w:tc>
+          <w:tcPr>
+            <w:tcBorders>
+              <w:bottom w:val="none" w:sz="0" w:space="0" w:color="000000"/>
+              <w:top w:val="none" w:sz="0" w:space="0" w:color="000000"/>
+              <w:left w:val="none" w:sz="0" w:space="0" w:color="000000"/>
+              <w:right w:val="none" w:sz="0" w:space="0" w:color="000000"/>
+            </w:tcBorders>
+            <w:shd w:val="clear" w:color="auto" w:fill="FFFFFF"/>
+            <w:tcMar>
+              <w:top w:w="0" w:type="dxa"/>
+              <w:bottom w:w="0" w:type="dxa"/>
+              <w:left w:w="0" w:type="dxa"/>
+              <w:right w:w="0" w:type="dxa"/>
+            </w:tcMar>
+            <w:vAlign w:val="center"/>
+          </w:tcPr>
+          <w:p>
+            <w:pPr>
+              <w:jc w:val="center"/>
+              <w:pBdr>
+                <w:bottom w:val="none" w:sz="0" w:space="0" w:color="000000"/>
+                <w:top w:val="none" w:sz="0" w:space="0" w:color="000000"/>
+                <w:left w:val="none" w:sz="0" w:space="0" w:color="000000"/>
+                <w:right w:val="none" w:sz="0" w:space="0" w:color="000000"/>
+              </w:pBdr>
+              <w:spacing w:after="100" w:before="100" w:line="240"/>
+              <w:ind w:left="100" w:right="100" w:firstLine="0" w:firstLineChars="0"/>
+              <w:rPr>
+                <w:rFonts w:ascii="Helvetica" w:hAnsi="Helvetica" w:eastAsia="Helvetica" w:cs="Helvetica"/>
+                <w:i w:val="false"/>
+                <w:b w:val="false"/>
+                <w:u w:val="none"/>
+                <w:sz w:val="20"/>
+                <w:szCs w:val="20"/>
+                <w:color w:val="000000"/>
+              </w:rPr>
+            </w:pPr>
+            <w:r>
+              <w:rPr>
+                <w:rFonts w:ascii="Helvetica" w:hAnsi="Helvetica" w:eastAsia="Helvetica" w:cs="Helvetica"/>
+                <w:i w:val="false"/>
+                <w:b w:val="false"/>
+                <w:u w:val="none"/>
+                <w:sz w:val="20"/>
+                <w:szCs w:val="20"/>
+                <w:color w:val="000000"/>
+              </w:rPr>
+              <w:t xml:space="preserve">3 [2–8]</w:t>
+            </w:r>
+          </w:p>
+        </w:tc>
+      </w:tr>
+      <w:tr>
+        <w:trPr>
+          <w:trHeight w:val="360" w:hRule="auto"/>
+        </w:trPr>
+        body22
+        <w:tc>
+          <w:tcPr>
+            <w:tcBorders>
+              <w:bottom w:val="none" w:sz="0" w:space="0" w:color="000000"/>
+              <w:top w:val="none" w:sz="0" w:space="0" w:color="000000"/>
+              <w:left w:val="none" w:sz="0" w:space="0" w:color="000000"/>
+              <w:right w:val="none" w:sz="0" w:space="0" w:color="000000"/>
+            </w:tcBorders>
+            <w:shd w:val="clear" w:color="auto" w:fill="FFFFFF"/>
+            <w:tcMar>
+              <w:top w:w="0" w:type="dxa"/>
+              <w:bottom w:w="0" w:type="dxa"/>
+              <w:left w:w="0" w:type="dxa"/>
+              <w:right w:w="0" w:type="dxa"/>
+            </w:tcMar>
+            <w:vAlign w:val="center"/>
+          </w:tcPr>
+          <w:p>
+            <w:pPr>
+              <w:jc w:val="left"/>
+              <w:pBdr>
+                <w:bottom w:val="none" w:sz="0" w:space="0" w:color="000000"/>
+                <w:top w:val="none" w:sz="0" w:space="0" w:color="000000"/>
+                <w:left w:val="none" w:sz="0" w:space="0" w:color="000000"/>
+                <w:right w:val="none" w:sz="0" w:space="0" w:color="000000"/>
+              </w:pBdr>
+              <w:spacing w:after="100" w:before="100" w:line="240"/>
+              <w:ind w:left="100" w:right="100" w:firstLine="0" w:firstLineChars="0"/>
+              <w:rPr>
+                <w:rFonts w:ascii="Helvetica" w:hAnsi="Helvetica" w:eastAsia="Helvetica" w:cs="Helvetica"/>
+                <w:i w:val="false"/>
+                <w:b w:val="false"/>
+                <w:u w:val="none"/>
+                <w:sz w:val="20"/>
+                <w:szCs w:val="20"/>
+                <w:color w:val="000000"/>
+              </w:rPr>
+            </w:pPr>
+            <w:r>
+              <w:rPr>
+                <w:rFonts w:ascii="Helvetica" w:hAnsi="Helvetica" w:eastAsia="Helvetica" w:cs="Helvetica"/>
+                <w:i w:val="false"/>
+                <w:b w:val="false"/>
+                <w:u w:val="none"/>
+                <w:sz w:val="20"/>
+                <w:szCs w:val="20"/>
+                <w:color w:val="000000"/>
+              </w:rPr>
+              <w:t xml:space="preserve">readmission_wi_30d: N</w:t>
+            </w:r>
+          </w:p>
+        </w:tc>
+        <w:tc>
+          <w:tcPr>
+            <w:tcBorders>
+              <w:bottom w:val="none" w:sz="0" w:space="0" w:color="000000"/>
+              <w:top w:val="none" w:sz="0" w:space="0" w:color="000000"/>
+              <w:left w:val="none" w:sz="0" w:space="0" w:color="000000"/>
+              <w:right w:val="none" w:sz="0" w:space="0" w:color="000000"/>
+            </w:tcBorders>
+            <w:shd w:val="clear" w:color="auto" w:fill="FFFFFF"/>
+            <w:tcMar>
+              <w:top w:w="0" w:type="dxa"/>
+              <w:bottom w:w="0" w:type="dxa"/>
+              <w:left w:w="0" w:type="dxa"/>
+              <w:right w:w="0" w:type="dxa"/>
+            </w:tcMar>
+            <w:vAlign w:val="center"/>
+          </w:tcPr>
+          <w:p>
+            <w:pPr>
+              <w:jc w:val="center"/>
+              <w:pBdr>
+                <w:bottom w:val="none" w:sz="0" w:space="0" w:color="000000"/>
+                <w:top w:val="none" w:sz="0" w:space="0" w:color="000000"/>
+                <w:left w:val="none" w:sz="0" w:space="0" w:color="000000"/>
+                <w:right w:val="none" w:sz="0" w:space="0" w:color="000000"/>
+              </w:pBdr>
+              <w:spacing w:after="100" w:before="100" w:line="240"/>
+              <w:ind w:left="100" w:right="100" w:firstLine="0" w:firstLineChars="0"/>
+              <w:rPr>
+                <w:rFonts w:ascii="Helvetica" w:hAnsi="Helvetica" w:eastAsia="Helvetica" w:cs="Helvetica"/>
+                <w:i w:val="false"/>
+                <w:b w:val="false"/>
+                <w:u w:val="none"/>
+                <w:sz w:val="20"/>
+                <w:szCs w:val="20"/>
+                <w:color w:val="000000"/>
+              </w:rPr>
+            </w:pPr>
+            <w:r>
+              <w:rPr>
+                <w:rFonts w:ascii="Helvetica" w:hAnsi="Helvetica" w:eastAsia="Helvetica" w:cs="Helvetica"/>
+                <w:i w:val="false"/>
+                <w:b w:val="false"/>
+                <w:u w:val="none"/>
+                <w:sz w:val="20"/>
+                <w:szCs w:val="20"/>
+                <w:color w:val="000000"/>
+              </w:rPr>
+              <w:t xml:space="preserve">63 (85%)</w:t>
+            </w:r>
+          </w:p>
+        </w:tc>
+        <w:tc>
+          <w:tcPr>
+            <w:tcBorders>
+              <w:bottom w:val="none" w:sz="0" w:space="0" w:color="000000"/>
+              <w:top w:val="none" w:sz="0" w:space="0" w:color="000000"/>
+              <w:left w:val="none" w:sz="0" w:space="0" w:color="000000"/>
+              <w:right w:val="none" w:sz="0" w:space="0" w:color="000000"/>
+            </w:tcBorders>
+            <w:shd w:val="clear" w:color="auto" w:fill="FFFFFF"/>
+            <w:tcMar>
+              <w:top w:w="0" w:type="dxa"/>
+              <w:bottom w:w="0" w:type="dxa"/>
+              <w:left w:w="0" w:type="dxa"/>
+              <w:right w:w="0" w:type="dxa"/>
+            </w:tcMar>
+            <w:vAlign w:val="center"/>
+          </w:tcPr>
+          <w:p>
+            <w:pPr>
+              <w:jc w:val="center"/>
+              <w:pBdr>
+                <w:bottom w:val="none" w:sz="0" w:space="0" w:color="000000"/>
+                <w:top w:val="none" w:sz="0" w:space="0" w:color="000000"/>
+                <w:left w:val="none" w:sz="0" w:space="0" w:color="000000"/>
+                <w:right w:val="none" w:sz="0" w:space="0" w:color="000000"/>
+              </w:pBdr>
+              <w:spacing w:after="100" w:before="100" w:line="240"/>
+              <w:ind w:left="100" w:right="100" w:firstLine="0" w:firstLineChars="0"/>
+              <w:rPr>
+                <w:rFonts w:ascii="Helvetica" w:hAnsi="Helvetica" w:eastAsia="Helvetica" w:cs="Helvetica"/>
+                <w:i w:val="false"/>
+                <w:b w:val="false"/>
+                <w:u w:val="none"/>
+                <w:sz w:val="20"/>
+                <w:szCs w:val="20"/>
+                <w:color w:val="000000"/>
+              </w:rPr>
+            </w:pPr>
+            <w:r>
+              <w:rPr>
+                <w:rFonts w:ascii="Helvetica" w:hAnsi="Helvetica" w:eastAsia="Helvetica" w:cs="Helvetica"/>
+                <w:i w:val="false"/>
+                <w:b w:val="false"/>
+                <w:u w:val="none"/>
+                <w:sz w:val="20"/>
+                <w:szCs w:val="20"/>
+                <w:color w:val="000000"/>
+              </w:rPr>
+              <w:t xml:space="preserve"/>
+            </w:r>
+          </w:p>
+        </w:tc>
+        <w:tc>
+          <w:tcPr>
+            <w:tcBorders>
+              <w:bottom w:val="none" w:sz="0" w:space="0" w:color="000000"/>
+              <w:top w:val="none" w:sz="0" w:space="0" w:color="000000"/>
+              <w:left w:val="none" w:sz="0" w:space="0" w:color="000000"/>
+              <w:right w:val="none" w:sz="0" w:space="0" w:color="000000"/>
+            </w:tcBorders>
+            <w:shd w:val="clear" w:color="auto" w:fill="FFFFFF"/>
+            <w:tcMar>
+              <w:top w:w="0" w:type="dxa"/>
+              <w:bottom w:w="0" w:type="dxa"/>
+              <w:left w:w="0" w:type="dxa"/>
+              <w:right w:w="0" w:type="dxa"/>
+            </w:tcMar>
+            <w:vAlign w:val="center"/>
+          </w:tcPr>
+          <w:p>
+            <w:pPr>
+              <w:jc w:val="center"/>
+              <w:pBdr>
+                <w:bottom w:val="none" w:sz="0" w:space="0" w:color="000000"/>
+                <w:top w:val="none" w:sz="0" w:space="0" w:color="000000"/>
+                <w:left w:val="none" w:sz="0" w:space="0" w:color="000000"/>
+                <w:right w:val="none" w:sz="0" w:space="0" w:color="000000"/>
+              </w:pBdr>
+              <w:spacing w:after="100" w:before="100" w:line="240"/>
+              <w:ind w:left="100" w:right="100" w:firstLine="0" w:firstLineChars="0"/>
+              <w:rPr>
+                <w:rFonts w:ascii="Helvetica" w:hAnsi="Helvetica" w:eastAsia="Helvetica" w:cs="Helvetica"/>
+                <w:i w:val="false"/>
+                <w:b w:val="false"/>
+                <w:u w:val="none"/>
+                <w:sz w:val="20"/>
+                <w:szCs w:val="20"/>
+                <w:color w:val="000000"/>
+              </w:rPr>
+            </w:pPr>
+            <w:r>
+              <w:rPr>
+                <w:rFonts w:ascii="Helvetica" w:hAnsi="Helvetica" w:eastAsia="Helvetica" w:cs="Helvetica"/>
+                <w:i w:val="false"/>
+                <w:b w:val="false"/>
+                <w:u w:val="none"/>
+                <w:sz w:val="20"/>
+                <w:szCs w:val="20"/>
+                <w:color w:val="000000"/>
+              </w:rPr>
+              <w:t xml:space="preserve"/>
+            </w:r>
+          </w:p>
+        </w:tc>
+      </w:tr>
+      <w:tr>
+        <w:trPr>
+          <w:trHeight w:val="360" w:hRule="auto"/>
+        </w:trPr>
+        body23
         <w:tc>
           <w:tcPr>
             <w:tcBorders>

</xml_diff>